<commit_message>
feat(curriculum): complete architectural and pedagogical modernization across labs, printables, games, family co-op, and fluency
</commit_message>
<xml_diff>
--- a/lessons/1-1/downloads/1-1-notes-l1.docx
+++ b/lessons/1-1/downloads/1-1-notes-l1.docx
@@ -264,49 +264,269 @@
           <w:sz w:val="19"/>
           <w:szCs w:val="19"/>
         </w:rPr>
-        <w:t xml:space="preserve">Look at the picture, read the word, then read what it means.</w:t>
+        <w:t xml:space="preserve">Review each concept term, definition, non-example, and visual clue.</w:t>
       </w:r>
     </w:p>
     <w:tbl>
       <w:tblPr>
-        <w:tblW w:type="pct" w:w="100%"/>
+        <w:tblW w:type="dxa" w:w="9360"/>
         <w:tblBorders>
-          <w:top w:val="none" w:color="FFFFFF" w:sz="0"/>
-          <w:left w:val="none" w:color="FFFFFF" w:sz="0"/>
-          <w:bottom w:val="single" w:color="C7D2DD" w:sz="4"/>
-          <w:right w:val="none" w:color="FFFFFF" w:sz="0"/>
-          <w:insideH w:val="none" w:color="FFFFFF" w:sz="0"/>
-          <w:insideV w:val="none" w:color="FFFFFF" w:sz="0"/>
+          <w:top w:val="single" w:color="C7D2DD" w:sz="6"/>
+          <w:left w:val="single" w:color="C7D2DD" w:sz="6"/>
+          <w:bottom w:val="single" w:color="C7D2DD" w:sz="6"/>
+          <w:right w:val="single" w:color="C7D2DD" w:sz="6"/>
+          <w:insideH w:val="single" w:color="C7D2DD" w:sz="6"/>
+          <w:insideV w:val="single" w:color="C7D2DD" w:sz="6"/>
         </w:tblBorders>
       </w:tblPr>
       <w:tblGrid>
         <w:gridCol w:w="1800"/>
-        <w:gridCol w:w="7560"/>
+        <w:gridCol w:w="3160"/>
+        <w:gridCol w:w="2200"/>
+        <w:gridCol w:w="2200"/>
       </w:tblGrid>
       <w:tr>
         <w:trPr>
           <w:cantSplit/>
+          <w:tblHeader/>
         </w:trPr>
         <w:tc>
           <w:tcPr>
             <w:tcW w:type="dxa" w:w="1800"/>
-            <w:tcMar>
-              <w:top w:type="dxa" w:w="100"/>
-              <w:left w:type="dxa" w:w="40"/>
-              <w:bottom w:type="dxa" w:w="100"/>
-              <w:right w:type="dxa" w:w="120"/>
-            </w:tcMar>
-            <w:vAlign w:val="center"/>
+            <w:shd w:fill="EEF4F8" w:color="auto" w:val="clear"/>
+            <w:tcMar>
+              <w:top w:type="dxa" w:w="80"/>
+              <w:left w:type="dxa" w:w="100"/>
+              <w:bottom w:type="dxa" w:w="80"/>
+              <w:right w:type="dxa" w:w="100"/>
+            </w:tcMar>
           </w:tcPr>
           <w:p>
             <w:pPr>
               <w:spacing w:after="0"/>
+            </w:pPr>
+            <w:r>
+              <w:rPr>
+                <w:b/>
+                <w:bCs/>
+                <w:color w:val="12355B"/>
+                <w:sz w:val="19"/>
+                <w:szCs w:val="19"/>
+              </w:rPr>
+              <w:t xml:space="preserve">Concept Term</w:t>
+            </w:r>
+          </w:p>
+        </w:tc>
+        <w:tc>
+          <w:tcPr>
+            <w:tcW w:type="dxa" w:w="3160"/>
+            <w:shd w:fill="EEF4F8" w:color="auto" w:val="clear"/>
+            <w:tcMar>
+              <w:top w:type="dxa" w:w="80"/>
+              <w:left w:type="dxa" w:w="100"/>
+              <w:bottom w:type="dxa" w:w="80"/>
+              <w:right w:type="dxa" w:w="100"/>
+            </w:tcMar>
+          </w:tcPr>
+          <w:p>
+            <w:pPr>
+              <w:spacing w:after="0"/>
+            </w:pPr>
+            <w:r>
+              <w:rPr>
+                <w:b/>
+                <w:bCs/>
+                <w:color w:val="12355B"/>
+                <w:sz w:val="19"/>
+                <w:szCs w:val="19"/>
+              </w:rPr>
+              <w:t xml:space="preserve">Student-Friendly Definition</w:t>
+            </w:r>
+          </w:p>
+        </w:tc>
+        <w:tc>
+          <w:tcPr>
+            <w:tcW w:type="dxa" w:w="2200"/>
+            <w:shd w:fill="EEF4F8" w:color="auto" w:val="clear"/>
+            <w:tcMar>
+              <w:top w:type="dxa" w:w="80"/>
+              <w:left w:type="dxa" w:w="100"/>
+              <w:bottom w:type="dxa" w:w="80"/>
+              <w:right w:type="dxa" w:w="100"/>
+            </w:tcMar>
+          </w:tcPr>
+          <w:p>
+            <w:pPr>
+              <w:spacing w:after="0"/>
+            </w:pPr>
+            <w:r>
+              <w:rPr>
+                <w:b/>
+                <w:bCs/>
+                <w:color w:val="12355B"/>
+                <w:sz w:val="19"/>
+                <w:szCs w:val="19"/>
+              </w:rPr>
+              <w:t xml:space="preserve">Non-Example</w:t>
+            </w:r>
+          </w:p>
+        </w:tc>
+        <w:tc>
+          <w:tcPr>
+            <w:tcW w:type="dxa" w:w="2200"/>
+            <w:shd w:fill="EEF4F8" w:color="auto" w:val="clear"/>
+            <w:tcMar>
+              <w:top w:type="dxa" w:w="80"/>
+              <w:left w:type="dxa" w:w="100"/>
+              <w:bottom w:type="dxa" w:w="80"/>
+              <w:right w:type="dxa" w:w="100"/>
+            </w:tcMar>
+          </w:tcPr>
+          <w:p>
+            <w:pPr>
+              <w:spacing w:after="0"/>
+            </w:pPr>
+            <w:r>
+              <w:rPr>
+                <w:b/>
+                <w:bCs/>
+                <w:color w:val="12355B"/>
+                <w:sz w:val="19"/>
+                <w:szCs w:val="19"/>
+              </w:rPr>
+              <w:t xml:space="preserve">Visual Clue</w:t>
+            </w:r>
+          </w:p>
+        </w:tc>
+      </w:tr>
+      <w:tr>
+        <w:trPr>
+          <w:cantSplit/>
+        </w:trPr>
+        <w:tc>
+          <w:tcPr>
+            <w:tcW w:type="dxa" w:w="1800"/>
+            <w:tcMar>
+              <w:top w:type="dxa" w:w="80"/>
+              <w:left w:type="dxa" w:w="100"/>
+              <w:bottom w:type="dxa" w:w="80"/>
+              <w:right w:type="dxa" w:w="100"/>
+            </w:tcMar>
+            <w:vAlign w:val="top"/>
+          </w:tcPr>
+          <w:p>
+            <w:pPr>
+              <w:spacing w:after="30"/>
+            </w:pPr>
+            <w:r>
+              <w:rPr>
+                <w:b/>
+                <w:bCs/>
+                <w:color w:val="12355B"/>
+                <w:sz w:val="21"/>
+                <w:szCs w:val="21"/>
+              </w:rPr>
+              <w:t xml:space="preserve">doer of math</w:t>
+            </w:r>
+          </w:p>
+          <w:p>
+            <w:pPr>
+              <w:spacing w:after="0"/>
+            </w:pPr>
+            <w:r>
+              <w:rPr>
+                <w:i/>
+                <w:iCs/>
+                <w:color w:val="5F6F80"/>
+                <w:sz w:val="18"/>
+                <w:szCs w:val="18"/>
+              </w:rPr>
+              <w:t xml:space="preserve">persona que hace matemáticas</w:t>
+            </w:r>
+          </w:p>
+        </w:tc>
+        <w:tc>
+          <w:tcPr>
+            <w:tcW w:type="dxa" w:w="3160"/>
+            <w:tcMar>
+              <w:top w:type="dxa" w:w="80"/>
+              <w:left w:type="dxa" w:w="100"/>
+              <w:bottom w:type="dxa" w:w="80"/>
+              <w:right w:type="dxa" w:w="100"/>
+            </w:tcMar>
+            <w:vAlign w:val="top"/>
+          </w:tcPr>
+          <w:p>
+            <w:pPr>
+              <w:spacing w:after="0"/>
+            </w:pPr>
+            <w:r>
+              <w:rPr>
+                <w:sz w:val="20"/>
+                <w:szCs w:val="20"/>
+              </w:rPr>
+              <w:t xml:space="preserve">Anyone who uses mathematical thinking — which is everyone, every day.</w:t>
+            </w:r>
+          </w:p>
+        </w:tc>
+        <w:tc>
+          <w:tcPr>
+            <w:tcW w:type="dxa" w:w="2200"/>
+            <w:tcMar>
+              <w:top w:type="dxa" w:w="80"/>
+              <w:left w:type="dxa" w:w="100"/>
+              <w:bottom w:type="dxa" w:w="80"/>
+              <w:right w:type="dxa" w:w="100"/>
+            </w:tcMar>
+            <w:vAlign w:val="top"/>
+          </w:tcPr>
+          <w:p>
+            <w:pPr>
+              <w:spacing w:after="40"/>
+            </w:pPr>
+            <w:r>
+              <w:rPr>
+                <w:i/>
+                <w:iCs/>
+                <w:color w:val="5F6F80"/>
+                <w:sz w:val="19"/>
+                <w:szCs w:val="19"/>
+              </w:rPr>
+              <w:t xml:space="preserve">Not doer of math: write a counter-example that breaks the definition.</w:t>
+            </w:r>
+          </w:p>
+          <w:p>
+            <w:pPr>
+              <w:pBdr>
+                <w:bottom w:val="single" w:color="AFBECC" w:sz="6"/>
+              </w:pBdr>
+              <w:spacing w:after="30" w:before="150"/>
+            </w:pPr>
+            <w:r>
+              <w:t xml:space="preserve"/>
+            </w:r>
+          </w:p>
+        </w:tc>
+        <w:tc>
+          <w:tcPr>
+            <w:tcW w:type="dxa" w:w="2200"/>
+            <w:tcMar>
+              <w:top w:type="dxa" w:w="80"/>
+              <w:left w:type="dxa" w:w="100"/>
+              <w:bottom w:type="dxa" w:w="80"/>
+              <w:right w:type="dxa" w:w="100"/>
+            </w:tcMar>
+            <w:vAlign w:val="top"/>
+          </w:tcPr>
+          <w:p>
+            <w:pPr>
+              <w:spacing w:after="40"/>
               <w:jc w:val="center"/>
             </w:pPr>
             <w:r>
               <w:drawing>
                 <wp:inline distT="0" distB="0" distL="0" distR="0">
-                  <wp:extent cx="1047750" cy="790575"/>
+                  <wp:extent cx="876300" cy="657225"/>
                   <wp:effectExtent t="0" r="0" b="0" l="0"/>
                   <wp:docPr id="1" name="" descr="" title=""/>
                   <wp:cNvGraphicFramePr>
@@ -331,7 +551,7 @@
                         <pic:spPr bwMode="auto">
                           <a:xfrm>
                             <a:off x="0" y="0"/>
-                            <a:ext cx="1047750" cy="790575"/>
+                            <a:ext cx="876300" cy="657225"/>
                           </a:xfrm>
                           <a:prstGeom prst="rect">
                             <a:avLst/>
@@ -344,32 +564,108 @@
               </w:drawing>
             </w:r>
           </w:p>
-        </w:tc>
-        <w:tc>
-          <w:tcPr>
-            <w:tcW w:type="dxa" w:w="7560"/>
-            <w:tcMar>
-              <w:top w:type="dxa" w:w="100"/>
-              <w:left w:type="dxa" w:w="40"/>
-              <w:bottom w:type="dxa" w:w="100"/>
-              <w:right w:type="dxa" w:w="40"/>
-            </w:tcMar>
-            <w:vAlign w:val="center"/>
-          </w:tcPr>
-          <w:p>
-            <w:pPr>
-              <w:spacing w:after="50"/>
+          <w:p>
+            <w:pPr>
+              <w:spacing w:after="0"/>
+            </w:pPr>
+            <w:r>
+              <w:rPr>
+                <w:i/>
+                <w:iCs/>
+                <w:color w:val="5F6F80"/>
+                <w:sz w:val="18"/>
+                <w:szCs w:val="18"/>
+              </w:rPr>
+              <w:t xml:space="preserve">Splitting a bill 4 ways at dinner — that is a doer of math.</w:t>
+            </w:r>
+          </w:p>
+        </w:tc>
+      </w:tr>
+      <w:tr>
+        <w:trPr>
+          <w:cantSplit/>
+        </w:trPr>
+        <w:tc>
+          <w:tcPr>
+            <w:tcW w:type="dxa" w:w="1800"/>
+            <w:tcMar>
+              <w:top w:type="dxa" w:w="80"/>
+              <w:left w:type="dxa" w:w="100"/>
+              <w:bottom w:type="dxa" w:w="80"/>
+              <w:right w:type="dxa" w:w="100"/>
+            </w:tcMar>
+            <w:vAlign w:val="top"/>
+          </w:tcPr>
+          <w:p>
+            <w:pPr>
+              <w:spacing w:after="30"/>
             </w:pPr>
             <w:r>
               <w:rPr>
                 <w:b/>
                 <w:bCs/>
                 <w:color w:val="12355B"/>
-                <w:sz w:val="24"/>
-                <w:szCs w:val="24"/>
-              </w:rPr>
-              <w:t xml:space="preserve">doer of math</w:t>
-            </w:r>
+                <w:sz w:val="21"/>
+                <w:szCs w:val="21"/>
+              </w:rPr>
+              <w:t xml:space="preserve">math story</w:t>
+            </w:r>
+          </w:p>
+          <w:p>
+            <w:pPr>
+              <w:spacing w:after="0"/>
+            </w:pPr>
+            <w:r>
+              <w:rPr>
+                <w:i/>
+                <w:iCs/>
+                <w:color w:val="5F6F80"/>
+                <w:sz w:val="18"/>
+                <w:szCs w:val="18"/>
+              </w:rPr>
+              <w:t xml:space="preserve">historia matemática</w:t>
+            </w:r>
+          </w:p>
+        </w:tc>
+        <w:tc>
+          <w:tcPr>
+            <w:tcW w:type="dxa" w:w="3160"/>
+            <w:tcMar>
+              <w:top w:type="dxa" w:w="80"/>
+              <w:left w:type="dxa" w:w="100"/>
+              <w:bottom w:type="dxa" w:w="80"/>
+              <w:right w:type="dxa" w:w="100"/>
+            </w:tcMar>
+            <w:vAlign w:val="top"/>
+          </w:tcPr>
+          <w:p>
+            <w:pPr>
+              <w:spacing w:after="0"/>
+            </w:pPr>
+            <w:r>
+              <w:rPr>
+                <w:sz w:val="20"/>
+                <w:szCs w:val="20"/>
+              </w:rPr>
+              <w:t xml:space="preserve">Your own history with mathematics — what you have done, felt, and learned so far.</w:t>
+            </w:r>
+          </w:p>
+        </w:tc>
+        <w:tc>
+          <w:tcPr>
+            <w:tcW w:type="dxa" w:w="2200"/>
+            <w:tcMar>
+              <w:top w:type="dxa" w:w="80"/>
+              <w:left w:type="dxa" w:w="100"/>
+              <w:bottom w:type="dxa" w:w="80"/>
+              <w:right w:type="dxa" w:w="100"/>
+            </w:tcMar>
+            <w:vAlign w:val="top"/>
+          </w:tcPr>
+          <w:p>
+            <w:pPr>
+              <w:spacing w:after="40"/>
+            </w:pPr>
             <w:r>
               <w:rPr>
                 <w:i/>
@@ -378,89 +674,41 @@
                 <w:sz w:val="19"/>
                 <w:szCs w:val="19"/>
               </w:rPr>
-              <w:t xml:space="preserve">   persona que hace matemáticas</w:t>
-            </w:r>
-          </w:p>
+              <w:t xml:space="preserve">Not math story: write a counter-example that breaks the definition.</w:t>
+            </w:r>
+          </w:p>
+          <w:p>
+            <w:pPr>
+              <w:pBdr>
+                <w:bottom w:val="single" w:color="AFBECC" w:sz="6"/>
+              </w:pBdr>
+              <w:spacing w:after="30" w:before="150"/>
+            </w:pPr>
+            <w:r>
+              <w:t xml:space="preserve"/>
+            </w:r>
+          </w:p>
+        </w:tc>
+        <w:tc>
+          <w:tcPr>
+            <w:tcW w:type="dxa" w:w="2200"/>
+            <w:tcMar>
+              <w:top w:type="dxa" w:w="80"/>
+              <w:left w:type="dxa" w:w="100"/>
+              <w:bottom w:type="dxa" w:w="80"/>
+              <w:right w:type="dxa" w:w="100"/>
+            </w:tcMar>
+            <w:vAlign w:val="top"/>
+          </w:tcPr>
           <w:p>
             <w:pPr>
               <w:spacing w:after="40"/>
-            </w:pPr>
-            <w:r>
-              <w:rPr>
-                <w:sz w:val="21"/>
-                <w:szCs w:val="21"/>
-              </w:rPr>
-              <w:t xml:space="preserve">Anyone who uses mathematical thinking — which is everyone, every day.</w:t>
-            </w:r>
-          </w:p>
-          <w:p>
-            <w:pPr>
-              <w:spacing w:after="0"/>
-            </w:pPr>
-            <w:r>
-              <w:rPr>
-                <w:b/>
-                <w:bCs/>
-                <w:color w:val="1FA6A2"/>
-                <w:sz w:val="18"/>
-                <w:szCs w:val="18"/>
-              </w:rPr>
-              <w:t xml:space="preserve">Example:  </w:t>
-            </w:r>
-            <w:r>
-              <w:rPr>
-                <w:i/>
-                <w:iCs/>
-                <w:color w:val="5F6F80"/>
-                <w:sz w:val="18"/>
-                <w:szCs w:val="18"/>
-              </w:rPr>
-              <w:t xml:space="preserve">Splitting a bill 4 ways at dinner — that is a doer of math.</w:t>
-            </w:r>
-          </w:p>
-        </w:tc>
-      </w:tr>
-    </w:tbl>
-    <w:tbl>
-      <w:tblPr>
-        <w:tblW w:type="pct" w:w="100%"/>
-        <w:tblBorders>
-          <w:top w:val="none" w:color="FFFFFF" w:sz="0"/>
-          <w:left w:val="none" w:color="FFFFFF" w:sz="0"/>
-          <w:bottom w:val="single" w:color="C7D2DD" w:sz="4"/>
-          <w:right w:val="none" w:color="FFFFFF" w:sz="0"/>
-          <w:insideH w:val="none" w:color="FFFFFF" w:sz="0"/>
-          <w:insideV w:val="none" w:color="FFFFFF" w:sz="0"/>
-        </w:tblBorders>
-      </w:tblPr>
-      <w:tblGrid>
-        <w:gridCol w:w="1800"/>
-        <w:gridCol w:w="7560"/>
-      </w:tblGrid>
-      <w:tr>
-        <w:trPr>
-          <w:cantSplit/>
-        </w:trPr>
-        <w:tc>
-          <w:tcPr>
-            <w:tcW w:type="dxa" w:w="1800"/>
-            <w:tcMar>
-              <w:top w:type="dxa" w:w="100"/>
-              <w:left w:type="dxa" w:w="40"/>
-              <w:bottom w:type="dxa" w:w="100"/>
-              <w:right w:type="dxa" w:w="120"/>
-            </w:tcMar>
-            <w:vAlign w:val="center"/>
-          </w:tcPr>
-          <w:p>
-            <w:pPr>
-              <w:spacing w:after="0"/>
               <w:jc w:val="center"/>
             </w:pPr>
             <w:r>
               <w:drawing>
                 <wp:inline distT="0" distB="0" distL="0" distR="0">
-                  <wp:extent cx="1047750" cy="790575"/>
+                  <wp:extent cx="876300" cy="657225"/>
                   <wp:effectExtent t="0" r="0" b="0" l="0"/>
                   <wp:docPr id="1" name="" descr="" title=""/>
                   <wp:cNvGraphicFramePr>
@@ -485,7 +733,7 @@
                         <pic:spPr bwMode="auto">
                           <a:xfrm>
                             <a:off x="0" y="0"/>
-                            <a:ext cx="1047750" cy="790575"/>
+                            <a:ext cx="876300" cy="657225"/>
                           </a:xfrm>
                           <a:prstGeom prst="rect">
                             <a:avLst/>
@@ -498,32 +746,108 @@
               </w:drawing>
             </w:r>
           </w:p>
-        </w:tc>
-        <w:tc>
-          <w:tcPr>
-            <w:tcW w:type="dxa" w:w="7560"/>
-            <w:tcMar>
-              <w:top w:type="dxa" w:w="100"/>
-              <w:left w:type="dxa" w:w="40"/>
-              <w:bottom w:type="dxa" w:w="100"/>
-              <w:right w:type="dxa" w:w="40"/>
-            </w:tcMar>
-            <w:vAlign w:val="center"/>
-          </w:tcPr>
-          <w:p>
-            <w:pPr>
-              <w:spacing w:after="50"/>
+          <w:p>
+            <w:pPr>
+              <w:spacing w:after="0"/>
+            </w:pPr>
+            <w:r>
+              <w:rPr>
+                <w:i/>
+                <w:iCs/>
+                <w:color w:val="5F6F80"/>
+                <w:sz w:val="18"/>
+                <w:szCs w:val="18"/>
+              </w:rPr>
+              <w:t xml:space="preserve">“In 3rd grade I hated fractions; this year I can explain them.”</w:t>
+            </w:r>
+          </w:p>
+        </w:tc>
+      </w:tr>
+      <w:tr>
+        <w:trPr>
+          <w:cantSplit/>
+        </w:trPr>
+        <w:tc>
+          <w:tcPr>
+            <w:tcW w:type="dxa" w:w="1800"/>
+            <w:tcMar>
+              <w:top w:type="dxa" w:w="80"/>
+              <w:left w:type="dxa" w:w="100"/>
+              <w:bottom w:type="dxa" w:w="80"/>
+              <w:right w:type="dxa" w:w="100"/>
+            </w:tcMar>
+            <w:vAlign w:val="top"/>
+          </w:tcPr>
+          <w:p>
+            <w:pPr>
+              <w:spacing w:after="30"/>
             </w:pPr>
             <w:r>
               <w:rPr>
                 <w:b/>
                 <w:bCs/>
                 <w:color w:val="12355B"/>
-                <w:sz w:val="24"/>
-                <w:szCs w:val="24"/>
-              </w:rPr>
-              <w:t xml:space="preserve">math story</w:t>
-            </w:r>
+                <w:sz w:val="21"/>
+                <w:szCs w:val="21"/>
+              </w:rPr>
+              <w:t xml:space="preserve">strength</w:t>
+            </w:r>
+          </w:p>
+          <w:p>
+            <w:pPr>
+              <w:spacing w:after="0"/>
+            </w:pPr>
+            <w:r>
+              <w:rPr>
+                <w:i/>
+                <w:iCs/>
+                <w:color w:val="5F6F80"/>
+                <w:sz w:val="18"/>
+                <w:szCs w:val="18"/>
+              </w:rPr>
+              <w:t xml:space="preserve">fortaleza</w:t>
+            </w:r>
+          </w:p>
+        </w:tc>
+        <w:tc>
+          <w:tcPr>
+            <w:tcW w:type="dxa" w:w="3160"/>
+            <w:tcMar>
+              <w:top w:type="dxa" w:w="80"/>
+              <w:left w:type="dxa" w:w="100"/>
+              <w:bottom w:type="dxa" w:w="80"/>
+              <w:right w:type="dxa" w:w="100"/>
+            </w:tcMar>
+            <w:vAlign w:val="top"/>
+          </w:tcPr>
+          <w:p>
+            <w:pPr>
+              <w:spacing w:after="0"/>
+            </w:pPr>
+            <w:r>
+              <w:rPr>
+                <w:sz w:val="20"/>
+                <w:szCs w:val="20"/>
+              </w:rPr>
+              <w:t xml:space="preserve">Something you already do well and can share with others.</w:t>
+            </w:r>
+          </w:p>
+        </w:tc>
+        <w:tc>
+          <w:tcPr>
+            <w:tcW w:type="dxa" w:w="2200"/>
+            <w:tcMar>
+              <w:top w:type="dxa" w:w="80"/>
+              <w:left w:type="dxa" w:w="100"/>
+              <w:bottom w:type="dxa" w:w="80"/>
+              <w:right w:type="dxa" w:w="100"/>
+            </w:tcMar>
+            <w:vAlign w:val="top"/>
+          </w:tcPr>
+          <w:p>
+            <w:pPr>
+              <w:spacing w:after="40"/>
+            </w:pPr>
             <w:r>
               <w:rPr>
                 <w:i/>
@@ -532,89 +856,41 @@
                 <w:sz w:val="19"/>
                 <w:szCs w:val="19"/>
               </w:rPr>
-              <w:t xml:space="preserve">   historia matemática</w:t>
-            </w:r>
-          </w:p>
+              <w:t xml:space="preserve">Not strength: write a counter-example that breaks the definition.</w:t>
+            </w:r>
+          </w:p>
+          <w:p>
+            <w:pPr>
+              <w:pBdr>
+                <w:bottom w:val="single" w:color="AFBECC" w:sz="6"/>
+              </w:pBdr>
+              <w:spacing w:after="30" w:before="150"/>
+            </w:pPr>
+            <w:r>
+              <w:t xml:space="preserve"/>
+            </w:r>
+          </w:p>
+        </w:tc>
+        <w:tc>
+          <w:tcPr>
+            <w:tcW w:type="dxa" w:w="2200"/>
+            <w:tcMar>
+              <w:top w:type="dxa" w:w="80"/>
+              <w:left w:type="dxa" w:w="100"/>
+              <w:bottom w:type="dxa" w:w="80"/>
+              <w:right w:type="dxa" w:w="100"/>
+            </w:tcMar>
+            <w:vAlign w:val="top"/>
+          </w:tcPr>
           <w:p>
             <w:pPr>
               <w:spacing w:after="40"/>
-            </w:pPr>
-            <w:r>
-              <w:rPr>
-                <w:sz w:val="21"/>
-                <w:szCs w:val="21"/>
-              </w:rPr>
-              <w:t xml:space="preserve">Your own history with mathematics — what you have done, felt, and learned so far.</w:t>
-            </w:r>
-          </w:p>
-          <w:p>
-            <w:pPr>
-              <w:spacing w:after="0"/>
-            </w:pPr>
-            <w:r>
-              <w:rPr>
-                <w:b/>
-                <w:bCs/>
-                <w:color w:val="1FA6A2"/>
-                <w:sz w:val="18"/>
-                <w:szCs w:val="18"/>
-              </w:rPr>
-              <w:t xml:space="preserve">Example:  </w:t>
-            </w:r>
-            <w:r>
-              <w:rPr>
-                <w:i/>
-                <w:iCs/>
-                <w:color w:val="5F6F80"/>
-                <w:sz w:val="18"/>
-                <w:szCs w:val="18"/>
-              </w:rPr>
-              <w:t xml:space="preserve">“In 3rd grade I hated fractions; this year I can explain them.”</w:t>
-            </w:r>
-          </w:p>
-        </w:tc>
-      </w:tr>
-    </w:tbl>
-    <w:tbl>
-      <w:tblPr>
-        <w:tblW w:type="pct" w:w="100%"/>
-        <w:tblBorders>
-          <w:top w:val="none" w:color="FFFFFF" w:sz="0"/>
-          <w:left w:val="none" w:color="FFFFFF" w:sz="0"/>
-          <w:bottom w:val="single" w:color="C7D2DD" w:sz="4"/>
-          <w:right w:val="none" w:color="FFFFFF" w:sz="0"/>
-          <w:insideH w:val="none" w:color="FFFFFF" w:sz="0"/>
-          <w:insideV w:val="none" w:color="FFFFFF" w:sz="0"/>
-        </w:tblBorders>
-      </w:tblPr>
-      <w:tblGrid>
-        <w:gridCol w:w="1800"/>
-        <w:gridCol w:w="7560"/>
-      </w:tblGrid>
-      <w:tr>
-        <w:trPr>
-          <w:cantSplit/>
-        </w:trPr>
-        <w:tc>
-          <w:tcPr>
-            <w:tcW w:type="dxa" w:w="1800"/>
-            <w:tcMar>
-              <w:top w:type="dxa" w:w="100"/>
-              <w:left w:type="dxa" w:w="40"/>
-              <w:bottom w:type="dxa" w:w="100"/>
-              <w:right w:type="dxa" w:w="120"/>
-            </w:tcMar>
-            <w:vAlign w:val="center"/>
-          </w:tcPr>
-          <w:p>
-            <w:pPr>
-              <w:spacing w:after="0"/>
               <w:jc w:val="center"/>
             </w:pPr>
             <w:r>
               <w:drawing>
                 <wp:inline distT="0" distB="0" distL="0" distR="0">
-                  <wp:extent cx="1047750" cy="790575"/>
+                  <wp:extent cx="876300" cy="657225"/>
                   <wp:effectExtent t="0" r="0" b="0" l="0"/>
                   <wp:docPr id="1" name="" descr="" title=""/>
                   <wp:cNvGraphicFramePr>
@@ -639,7 +915,7 @@
                         <pic:spPr bwMode="auto">
                           <a:xfrm>
                             <a:off x="0" y="0"/>
-                            <a:ext cx="1047750" cy="790575"/>
+                            <a:ext cx="876300" cy="657225"/>
                           </a:xfrm>
                           <a:prstGeom prst="rect">
                             <a:avLst/>
@@ -652,32 +928,108 @@
               </w:drawing>
             </w:r>
           </w:p>
-        </w:tc>
-        <w:tc>
-          <w:tcPr>
-            <w:tcW w:type="dxa" w:w="7560"/>
-            <w:tcMar>
-              <w:top w:type="dxa" w:w="100"/>
-              <w:left w:type="dxa" w:w="40"/>
-              <w:bottom w:type="dxa" w:w="100"/>
-              <w:right w:type="dxa" w:w="40"/>
-            </w:tcMar>
-            <w:vAlign w:val="center"/>
-          </w:tcPr>
-          <w:p>
-            <w:pPr>
-              <w:spacing w:after="50"/>
+          <w:p>
+            <w:pPr>
+              <w:spacing w:after="0"/>
+            </w:pPr>
+            <w:r>
+              <w:rPr>
+                <w:i/>
+                <w:iCs/>
+                <w:color w:val="5F6F80"/>
+                <w:sz w:val="18"/>
+                <w:szCs w:val="18"/>
+              </w:rPr>
+              <w:t xml:space="preserve">“I am good at mental math with money” — a strength you can teach.</w:t>
+            </w:r>
+          </w:p>
+        </w:tc>
+      </w:tr>
+      <w:tr>
+        <w:trPr>
+          <w:cantSplit/>
+        </w:trPr>
+        <w:tc>
+          <w:tcPr>
+            <w:tcW w:type="dxa" w:w="1800"/>
+            <w:tcMar>
+              <w:top w:type="dxa" w:w="80"/>
+              <w:left w:type="dxa" w:w="100"/>
+              <w:bottom w:type="dxa" w:w="80"/>
+              <w:right w:type="dxa" w:w="100"/>
+            </w:tcMar>
+            <w:vAlign w:val="top"/>
+          </w:tcPr>
+          <w:p>
+            <w:pPr>
+              <w:spacing w:after="30"/>
             </w:pPr>
             <w:r>
               <w:rPr>
                 <w:b/>
                 <w:bCs/>
                 <w:color w:val="12355B"/>
-                <w:sz w:val="24"/>
-                <w:szCs w:val="24"/>
-              </w:rPr>
-              <w:t xml:space="preserve">strength</w:t>
-            </w:r>
+                <w:sz w:val="21"/>
+                <w:szCs w:val="21"/>
+              </w:rPr>
+              <w:t xml:space="preserve">decompose</w:t>
+            </w:r>
+          </w:p>
+          <w:p>
+            <w:pPr>
+              <w:spacing w:after="0"/>
+            </w:pPr>
+            <w:r>
+              <w:rPr>
+                <w:i/>
+                <w:iCs/>
+                <w:color w:val="5F6F80"/>
+                <w:sz w:val="18"/>
+                <w:szCs w:val="18"/>
+              </w:rPr>
+              <w:t xml:space="preserve">descomponer</w:t>
+            </w:r>
+          </w:p>
+        </w:tc>
+        <w:tc>
+          <w:tcPr>
+            <w:tcW w:type="dxa" w:w="3160"/>
+            <w:tcMar>
+              <w:top w:type="dxa" w:w="80"/>
+              <w:left w:type="dxa" w:w="100"/>
+              <w:bottom w:type="dxa" w:w="80"/>
+              <w:right w:type="dxa" w:w="100"/>
+            </w:tcMar>
+            <w:vAlign w:val="top"/>
+          </w:tcPr>
+          <w:p>
+            <w:pPr>
+              <w:spacing w:after="0"/>
+            </w:pPr>
+            <w:r>
+              <w:rPr>
+                <w:sz w:val="20"/>
+                <w:szCs w:val="20"/>
+              </w:rPr>
+              <w:t xml:space="preserve">To break a number into parts that add, subtract, multiply, or divide back to it.</w:t>
+            </w:r>
+          </w:p>
+        </w:tc>
+        <w:tc>
+          <w:tcPr>
+            <w:tcW w:type="dxa" w:w="2200"/>
+            <w:tcMar>
+              <w:top w:type="dxa" w:w="80"/>
+              <w:left w:type="dxa" w:w="100"/>
+              <w:bottom w:type="dxa" w:w="80"/>
+              <w:right w:type="dxa" w:w="100"/>
+            </w:tcMar>
+            <w:vAlign w:val="top"/>
+          </w:tcPr>
+          <w:p>
+            <w:pPr>
+              <w:spacing w:after="40"/>
+            </w:pPr>
             <w:r>
               <w:rPr>
                 <w:i/>
@@ -686,89 +1038,41 @@
                 <w:sz w:val="19"/>
                 <w:szCs w:val="19"/>
               </w:rPr>
-              <w:t xml:space="preserve">   fortaleza</w:t>
-            </w:r>
-          </w:p>
+              <w:t xml:space="preserve">Not decompose: write a counter-example that breaks the definition.</w:t>
+            </w:r>
+          </w:p>
+          <w:p>
+            <w:pPr>
+              <w:pBdr>
+                <w:bottom w:val="single" w:color="AFBECC" w:sz="6"/>
+              </w:pBdr>
+              <w:spacing w:after="30" w:before="150"/>
+            </w:pPr>
+            <w:r>
+              <w:t xml:space="preserve"/>
+            </w:r>
+          </w:p>
+        </w:tc>
+        <w:tc>
+          <w:tcPr>
+            <w:tcW w:type="dxa" w:w="2200"/>
+            <w:tcMar>
+              <w:top w:type="dxa" w:w="80"/>
+              <w:left w:type="dxa" w:w="100"/>
+              <w:bottom w:type="dxa" w:w="80"/>
+              <w:right w:type="dxa" w:w="100"/>
+            </w:tcMar>
+            <w:vAlign w:val="top"/>
+          </w:tcPr>
           <w:p>
             <w:pPr>
               <w:spacing w:after="40"/>
-            </w:pPr>
-            <w:r>
-              <w:rPr>
-                <w:sz w:val="21"/>
-                <w:szCs w:val="21"/>
-              </w:rPr>
-              <w:t xml:space="preserve">Something you already do well and can share with others.</w:t>
-            </w:r>
-          </w:p>
-          <w:p>
-            <w:pPr>
-              <w:spacing w:after="0"/>
-            </w:pPr>
-            <w:r>
-              <w:rPr>
-                <w:b/>
-                <w:bCs/>
-                <w:color w:val="1FA6A2"/>
-                <w:sz w:val="18"/>
-                <w:szCs w:val="18"/>
-              </w:rPr>
-              <w:t xml:space="preserve">Example:  </w:t>
-            </w:r>
-            <w:r>
-              <w:rPr>
-                <w:i/>
-                <w:iCs/>
-                <w:color w:val="5F6F80"/>
-                <w:sz w:val="18"/>
-                <w:szCs w:val="18"/>
-              </w:rPr>
-              <w:t xml:space="preserve">“I am good at mental math with money” — a strength you can teach.</w:t>
-            </w:r>
-          </w:p>
-        </w:tc>
-      </w:tr>
-    </w:tbl>
-    <w:tbl>
-      <w:tblPr>
-        <w:tblW w:type="pct" w:w="100%"/>
-        <w:tblBorders>
-          <w:top w:val="none" w:color="FFFFFF" w:sz="0"/>
-          <w:left w:val="none" w:color="FFFFFF" w:sz="0"/>
-          <w:bottom w:val="single" w:color="C7D2DD" w:sz="4"/>
-          <w:right w:val="none" w:color="FFFFFF" w:sz="0"/>
-          <w:insideH w:val="none" w:color="FFFFFF" w:sz="0"/>
-          <w:insideV w:val="none" w:color="FFFFFF" w:sz="0"/>
-        </w:tblBorders>
-      </w:tblPr>
-      <w:tblGrid>
-        <w:gridCol w:w="1800"/>
-        <w:gridCol w:w="7560"/>
-      </w:tblGrid>
-      <w:tr>
-        <w:trPr>
-          <w:cantSplit/>
-        </w:trPr>
-        <w:tc>
-          <w:tcPr>
-            <w:tcW w:type="dxa" w:w="1800"/>
-            <w:tcMar>
-              <w:top w:type="dxa" w:w="100"/>
-              <w:left w:type="dxa" w:w="40"/>
-              <w:bottom w:type="dxa" w:w="100"/>
-              <w:right w:type="dxa" w:w="120"/>
-            </w:tcMar>
-            <w:vAlign w:val="center"/>
-          </w:tcPr>
-          <w:p>
-            <w:pPr>
-              <w:spacing w:after="0"/>
               <w:jc w:val="center"/>
             </w:pPr>
             <w:r>
               <w:drawing>
                 <wp:inline distT="0" distB="0" distL="0" distR="0">
-                  <wp:extent cx="1047750" cy="790575"/>
+                  <wp:extent cx="876300" cy="657225"/>
                   <wp:effectExtent t="0" r="0" b="0" l="0"/>
                   <wp:docPr id="1" name="" descr="" title=""/>
                   <wp:cNvGraphicFramePr>
@@ -793,7 +1097,7 @@
                         <pic:spPr bwMode="auto">
                           <a:xfrm>
                             <a:off x="0" y="0"/>
-                            <a:ext cx="1047750" cy="790575"/>
+                            <a:ext cx="876300" cy="657225"/>
                           </a:xfrm>
                           <a:prstGeom prst="rect">
                             <a:avLst/>
@@ -806,32 +1110,108 @@
               </w:drawing>
             </w:r>
           </w:p>
-        </w:tc>
-        <w:tc>
-          <w:tcPr>
-            <w:tcW w:type="dxa" w:w="7560"/>
-            <w:tcMar>
-              <w:top w:type="dxa" w:w="100"/>
-              <w:left w:type="dxa" w:w="40"/>
-              <w:bottom w:type="dxa" w:w="100"/>
-              <w:right w:type="dxa" w:w="40"/>
-            </w:tcMar>
-            <w:vAlign w:val="center"/>
-          </w:tcPr>
-          <w:p>
-            <w:pPr>
-              <w:spacing w:after="50"/>
+          <w:p>
+            <w:pPr>
+              <w:spacing w:after="0"/>
+            </w:pPr>
+            <w:r>
+              <w:rPr>
+                <w:i/>
+                <w:iCs/>
+                <w:color w:val="5F6F80"/>
+                <w:sz w:val="18"/>
+                <w:szCs w:val="18"/>
+              </w:rPr>
+              <w:t xml:space="preserve">78.5 = 70 + 8.5, and also 157 ÷ 2 — both rebuild the same number.</w:t>
+            </w:r>
+          </w:p>
+        </w:tc>
+      </w:tr>
+      <w:tr>
+        <w:trPr>
+          <w:cantSplit/>
+        </w:trPr>
+        <w:tc>
+          <w:tcPr>
+            <w:tcW w:type="dxa" w:w="1800"/>
+            <w:tcMar>
+              <w:top w:type="dxa" w:w="80"/>
+              <w:left w:type="dxa" w:w="100"/>
+              <w:bottom w:type="dxa" w:w="80"/>
+              <w:right w:type="dxa" w:w="100"/>
+            </w:tcMar>
+            <w:vAlign w:val="top"/>
+          </w:tcPr>
+          <w:p>
+            <w:pPr>
+              <w:spacing w:after="30"/>
             </w:pPr>
             <w:r>
               <w:rPr>
                 <w:b/>
                 <w:bCs/>
                 <w:color w:val="12355B"/>
-                <w:sz w:val="24"/>
-                <w:szCs w:val="24"/>
-              </w:rPr>
-              <w:t xml:space="preserve">decompose</w:t>
-            </w:r>
+                <w:sz w:val="21"/>
+                <w:szCs w:val="21"/>
+              </w:rPr>
+              <w:t xml:space="preserve">estimate</w:t>
+            </w:r>
+          </w:p>
+          <w:p>
+            <w:pPr>
+              <w:spacing w:after="0"/>
+            </w:pPr>
+            <w:r>
+              <w:rPr>
+                <w:i/>
+                <w:iCs/>
+                <w:color w:val="5F6F80"/>
+                <w:sz w:val="18"/>
+                <w:szCs w:val="18"/>
+              </w:rPr>
+              <w:t xml:space="preserve">estimar</w:t>
+            </w:r>
+          </w:p>
+        </w:tc>
+        <w:tc>
+          <w:tcPr>
+            <w:tcW w:type="dxa" w:w="3160"/>
+            <w:tcMar>
+              <w:top w:type="dxa" w:w="80"/>
+              <w:left w:type="dxa" w:w="100"/>
+              <w:bottom w:type="dxa" w:w="80"/>
+              <w:right w:type="dxa" w:w="100"/>
+            </w:tcMar>
+            <w:vAlign w:val="top"/>
+          </w:tcPr>
+          <w:p>
+            <w:pPr>
+              <w:spacing w:after="0"/>
+            </w:pPr>
+            <w:r>
+              <w:rPr>
+                <w:sz w:val="20"/>
+                <w:szCs w:val="20"/>
+              </w:rPr>
+              <w:t xml:space="preserve">A reasoned answer that is close enough to be useful, without counting every one.</w:t>
+            </w:r>
+          </w:p>
+        </w:tc>
+        <w:tc>
+          <w:tcPr>
+            <w:tcW w:type="dxa" w:w="2200"/>
+            <w:tcMar>
+              <w:top w:type="dxa" w:w="80"/>
+              <w:left w:type="dxa" w:w="100"/>
+              <w:bottom w:type="dxa" w:w="80"/>
+              <w:right w:type="dxa" w:w="100"/>
+            </w:tcMar>
+            <w:vAlign w:val="top"/>
+          </w:tcPr>
+          <w:p>
+            <w:pPr>
+              <w:spacing w:after="40"/>
+            </w:pPr>
             <w:r>
               <w:rPr>
                 <w:i/>
@@ -840,89 +1220,41 @@
                 <w:sz w:val="19"/>
                 <w:szCs w:val="19"/>
               </w:rPr>
-              <w:t xml:space="preserve">   descomponer</w:t>
-            </w:r>
-          </w:p>
+              <w:t xml:space="preserve">Not estimate: write a counter-example that breaks the definition.</w:t>
+            </w:r>
+          </w:p>
+          <w:p>
+            <w:pPr>
+              <w:pBdr>
+                <w:bottom w:val="single" w:color="AFBECC" w:sz="6"/>
+              </w:pBdr>
+              <w:spacing w:after="30" w:before="150"/>
+            </w:pPr>
+            <w:r>
+              <w:t xml:space="preserve"/>
+            </w:r>
+          </w:p>
+        </w:tc>
+        <w:tc>
+          <w:tcPr>
+            <w:tcW w:type="dxa" w:w="2200"/>
+            <w:tcMar>
+              <w:top w:type="dxa" w:w="80"/>
+              <w:left w:type="dxa" w:w="100"/>
+              <w:bottom w:type="dxa" w:w="80"/>
+              <w:right w:type="dxa" w:w="100"/>
+            </w:tcMar>
+            <w:vAlign w:val="top"/>
+          </w:tcPr>
           <w:p>
             <w:pPr>
               <w:spacing w:after="40"/>
-            </w:pPr>
-            <w:r>
-              <w:rPr>
-                <w:sz w:val="21"/>
-                <w:szCs w:val="21"/>
-              </w:rPr>
-              <w:t xml:space="preserve">To break a number into parts that add, subtract, multiply, or divide back to it.</w:t>
-            </w:r>
-          </w:p>
-          <w:p>
-            <w:pPr>
-              <w:spacing w:after="0"/>
-            </w:pPr>
-            <w:r>
-              <w:rPr>
-                <w:b/>
-                <w:bCs/>
-                <w:color w:val="1FA6A2"/>
-                <w:sz w:val="18"/>
-                <w:szCs w:val="18"/>
-              </w:rPr>
-              <w:t xml:space="preserve">Example:  </w:t>
-            </w:r>
-            <w:r>
-              <w:rPr>
-                <w:i/>
-                <w:iCs/>
-                <w:color w:val="5F6F80"/>
-                <w:sz w:val="18"/>
-                <w:szCs w:val="18"/>
-              </w:rPr>
-              <w:t xml:space="preserve">78.5 = 70 + 8.5, and also 157 ÷ 2 — both rebuild the same number.</w:t>
-            </w:r>
-          </w:p>
-        </w:tc>
-      </w:tr>
-    </w:tbl>
-    <w:tbl>
-      <w:tblPr>
-        <w:tblW w:type="pct" w:w="100%"/>
-        <w:tblBorders>
-          <w:top w:val="none" w:color="FFFFFF" w:sz="0"/>
-          <w:left w:val="none" w:color="FFFFFF" w:sz="0"/>
-          <w:bottom w:val="single" w:color="C7D2DD" w:sz="4"/>
-          <w:right w:val="none" w:color="FFFFFF" w:sz="0"/>
-          <w:insideH w:val="none" w:color="FFFFFF" w:sz="0"/>
-          <w:insideV w:val="none" w:color="FFFFFF" w:sz="0"/>
-        </w:tblBorders>
-      </w:tblPr>
-      <w:tblGrid>
-        <w:gridCol w:w="1800"/>
-        <w:gridCol w:w="7560"/>
-      </w:tblGrid>
-      <w:tr>
-        <w:trPr>
-          <w:cantSplit/>
-        </w:trPr>
-        <w:tc>
-          <w:tcPr>
-            <w:tcW w:type="dxa" w:w="1800"/>
-            <w:tcMar>
-              <w:top w:type="dxa" w:w="100"/>
-              <w:left w:type="dxa" w:w="40"/>
-              <w:bottom w:type="dxa" w:w="100"/>
-              <w:right w:type="dxa" w:w="120"/>
-            </w:tcMar>
-            <w:vAlign w:val="center"/>
-          </w:tcPr>
-          <w:p>
-            <w:pPr>
-              <w:spacing w:after="0"/>
               <w:jc w:val="center"/>
             </w:pPr>
             <w:r>
               <w:drawing>
                 <wp:inline distT="0" distB="0" distL="0" distR="0">
-                  <wp:extent cx="1047750" cy="790575"/>
+                  <wp:extent cx="876300" cy="657225"/>
                   <wp:effectExtent t="0" r="0" b="0" l="0"/>
                   <wp:docPr id="1" name="" descr="" title=""/>
                   <wp:cNvGraphicFramePr>
@@ -947,7 +1279,7 @@
                         <pic:spPr bwMode="auto">
                           <a:xfrm>
                             <a:off x="0" y="0"/>
-                            <a:ext cx="1047750" cy="790575"/>
+                            <a:ext cx="876300" cy="657225"/>
                           </a:xfrm>
                           <a:prstGeom prst="rect">
                             <a:avLst/>
@@ -960,69 +1292,10 @@
               </w:drawing>
             </w:r>
           </w:p>
-        </w:tc>
-        <w:tc>
-          <w:tcPr>
-            <w:tcW w:type="dxa" w:w="7560"/>
-            <w:tcMar>
-              <w:top w:type="dxa" w:w="100"/>
-              <w:left w:type="dxa" w:w="40"/>
-              <w:bottom w:type="dxa" w:w="100"/>
-              <w:right w:type="dxa" w:w="40"/>
-            </w:tcMar>
-            <w:vAlign w:val="center"/>
-          </w:tcPr>
-          <w:p>
-            <w:pPr>
-              <w:spacing w:after="50"/>
-            </w:pPr>
-            <w:r>
-              <w:rPr>
-                <w:b/>
-                <w:bCs/>
-                <w:color w:val="12355B"/>
-                <w:sz w:val="24"/>
-                <w:szCs w:val="24"/>
-              </w:rPr>
-              <w:t xml:space="preserve">estimate</w:t>
-            </w:r>
-            <w:r>
-              <w:rPr>
-                <w:i/>
-                <w:iCs/>
-                <w:color w:val="5F6F80"/>
-                <w:sz w:val="19"/>
-                <w:szCs w:val="19"/>
-              </w:rPr>
-              <w:t xml:space="preserve">   estimar</w:t>
-            </w:r>
-          </w:p>
-          <w:p>
-            <w:pPr>
-              <w:spacing w:after="40"/>
-            </w:pPr>
-            <w:r>
-              <w:rPr>
-                <w:sz w:val="21"/>
-                <w:szCs w:val="21"/>
-              </w:rPr>
-              <w:t xml:space="preserve">A reasoned answer that is close enough to be useful, without counting every one.</w:t>
-            </w:r>
-          </w:p>
           <w:p>
             <w:pPr>
               <w:spacing w:after="0"/>
             </w:pPr>
-            <w:r>
-              <w:rPr>
-                <w:b/>
-                <w:bCs/>
-                <w:color w:val="1FA6A2"/>
-                <w:sz w:val="18"/>
-                <w:szCs w:val="18"/>
-              </w:rPr>
-              <w:t xml:space="preserve">Example:  </w:t>
-            </w:r>
             <w:r>
               <w:rPr>
                 <w:i/>
@@ -3211,7 +3484,7 @@
           <w:sz w:val="19"/>
           <w:szCs w:val="19"/>
         </w:rPr>
-        <w:t xml:space="preserve">   You Do — show your work</w:t>
+        <w:t xml:space="preserve">   You Do — show your work and reasoning</w:t>
       </w:r>
     </w:p>
     <w:p>
@@ -3226,7 +3499,7 @@
           <w:sz w:val="19"/>
           <w:szCs w:val="19"/>
         </w:rPr>
-        <w:t xml:space="preserve">Solve each problem. Show your thinking in the work box.</w:t>
+        <w:t xml:space="preserve">Solve each problem in the middle column and explain your reasoning using the sentence starters on the right.</w:t>
       </w:r>
     </w:p>
     <w:p>
@@ -3255,120 +3528,219 @@
         <w:t xml:space="preserve">   extra scaffolding</w:t>
       </w:r>
     </w:p>
-    <w:p>
-      <w:pPr>
-        <w:keepNext/>
-        <w:spacing w:after="60" w:before="160"/>
-      </w:pPr>
-      <w:r>
-        <w:rPr>
-          <w:b/>
-          <w:bCs/>
-          <w:color w:val="12355B"/>
-          <w:sz w:val="22"/>
-          <w:szCs w:val="22"/>
-        </w:rPr>
-        <w:t xml:space="preserve">1.  </w:t>
-      </w:r>
-      <w:r>
-        <w:rPr>
-          <w:b/>
-          <w:bCs/>
-          <w:sz w:val="21"/>
-          <w:szCs w:val="21"/>
-        </w:rPr>
-        <w:t xml:space="preserve">Another correct decomposition of 78.5 is:</w:t>
-      </w:r>
-    </w:p>
-    <w:p>
-      <w:pPr>
-        <w:spacing w:after="40"/>
-        <w:ind w:left="420"/>
-      </w:pPr>
-      <w:r>
-        <w:rPr>
-          <w:sz w:val="20"/>
-          <w:szCs w:val="20"/>
-        </w:rPr>
-        <w:t xml:space="preserve">A)  75 − 3.5</w:t>
-      </w:r>
-    </w:p>
-    <w:p>
-      <w:pPr>
-        <w:spacing w:after="40"/>
-        <w:ind w:left="420"/>
-      </w:pPr>
-      <w:r>
-        <w:rPr>
-          <w:sz w:val="20"/>
-          <w:szCs w:val="20"/>
-        </w:rPr>
-        <w:t xml:space="preserve">B)  80 − 1.5</w:t>
-      </w:r>
-    </w:p>
-    <w:p>
-      <w:pPr>
-        <w:spacing w:after="40"/>
-        <w:ind w:left="420"/>
-      </w:pPr>
-      <w:r>
-        <w:rPr>
-          <w:sz w:val="20"/>
-          <w:szCs w:val="20"/>
-        </w:rPr>
-        <w:t xml:space="preserve">C)  80 − 2.5</w:t>
-      </w:r>
-    </w:p>
-    <w:p>
-      <w:pPr>
-        <w:spacing w:after="40"/>
-        <w:ind w:left="420"/>
-      </w:pPr>
-      <w:r>
-        <w:rPr>
-          <w:sz w:val="20"/>
-          <w:szCs w:val="20"/>
-        </w:rPr>
-        <w:t xml:space="preserve">D)  80 + 1.5</w:t>
-      </w:r>
-    </w:p>
-    <w:p>
-      <w:pPr>
-        <w:spacing w:after="20"/>
-      </w:pPr>
-      <w:r>
-        <w:t xml:space="preserve"/>
-      </w:r>
-    </w:p>
     <w:tbl>
       <w:tblPr>
-        <w:tblW w:type="pct" w:w="100%"/>
+        <w:tblW w:type="dxa" w:w="9360"/>
         <w:tblBorders>
           <w:top w:val="single" w:color="C7D2DD" w:sz="6"/>
           <w:left w:val="single" w:color="C7D2DD" w:sz="6"/>
           <w:bottom w:val="single" w:color="C7D2DD" w:sz="6"/>
           <w:right w:val="single" w:color="C7D2DD" w:sz="6"/>
-          <w:insideH w:val="single" w:color="auto" w:sz="4"/>
-          <w:insideV w:val="single" w:color="auto" w:sz="4"/>
+          <w:insideH w:val="single" w:color="C7D2DD" w:sz="6"/>
+          <w:insideV w:val="single" w:color="C7D2DD" w:sz="6"/>
         </w:tblBorders>
       </w:tblPr>
       <w:tblGrid>
-        <w:gridCol w:w="100"/>
+        <w:gridCol w:w="2800"/>
+        <w:gridCol w:w="3560"/>
+        <w:gridCol w:w="3000"/>
       </w:tblGrid>
       <w:tr>
-        <w:tc>
-          <w:tcPr>
+        <w:trPr>
+          <w:cantSplit/>
+          <w:tblHeader/>
+        </w:trPr>
+        <w:tc>
+          <w:tcPr>
+            <w:tcW w:type="dxa" w:w="2800"/>
+            <w:shd w:fill="EEF4F8" w:color="auto" w:val="clear"/>
+            <w:tcMar>
+              <w:top w:type="dxa" w:w="60"/>
+              <w:left w:type="dxa" w:w="100"/>
+              <w:bottom w:type="dxa" w:w="60"/>
+              <w:right w:type="dxa" w:w="100"/>
+            </w:tcMar>
+          </w:tcPr>
+          <w:p>
+            <w:pPr>
+              <w:spacing w:after="0"/>
+            </w:pPr>
+            <w:r>
+              <w:rPr>
+                <w:b/>
+                <w:bCs/>
+                <w:color w:val="12355B"/>
+                <w:sz w:val="16"/>
+                <w:szCs w:val="16"/>
+              </w:rPr>
+              <w:t xml:space="preserve">CORE PROBLEM / GIVEN REPRESENTATION</w:t>
+            </w:r>
+          </w:p>
+        </w:tc>
+        <w:tc>
+          <w:tcPr>
+            <w:tcW w:type="dxa" w:w="3560"/>
+            <w:shd w:fill="EEF4F8" w:color="auto" w:val="clear"/>
+            <w:tcMar>
+              <w:top w:type="dxa" w:w="60"/>
+              <w:left w:type="dxa" w:w="100"/>
+              <w:bottom w:type="dxa" w:w="60"/>
+              <w:right w:type="dxa" w:w="100"/>
+            </w:tcMar>
+          </w:tcPr>
+          <w:p>
+            <w:pPr>
+              <w:spacing w:after="0"/>
+            </w:pPr>
+            <w:r>
+              <w:rPr>
+                <w:b/>
+                <w:bCs/>
+                <w:color w:val="12355B"/>
+                <w:sz w:val="16"/>
+                <w:szCs w:val="16"/>
+              </w:rPr>
+              <w:t xml:space="preserve">WORKING SPACE / CALCULATION STEPS</w:t>
+            </w:r>
+          </w:p>
+        </w:tc>
+        <w:tc>
+          <w:tcPr>
+            <w:tcW w:type="dxa" w:w="3000"/>
             <w:shd w:fill="FBF3E2" w:color="auto" w:val="clear"/>
             <w:tcMar>
               <w:top w:type="dxa" w:w="60"/>
-              <w:left w:type="dxa" w:w="120"/>
+              <w:left w:type="dxa" w:w="100"/>
               <w:bottom w:type="dxa" w:w="60"/>
-              <w:right w:type="dxa" w:w="120"/>
-            </w:tcMar>
-          </w:tcPr>
-          <w:p>
-            <w:pPr>
-              <w:spacing w:after="0" w:line="320"/>
+              <w:right w:type="dxa" w:w="100"/>
+            </w:tcMar>
+          </w:tcPr>
+          <w:p>
+            <w:pPr>
+              <w:spacing w:after="0"/>
+            </w:pPr>
+            <w:r>
+              <w:rPr>
+                <w:b/>
+                <w:bCs/>
+                <w:color w:val="B97A12"/>
+                <w:sz w:val="16"/>
+                <w:szCs w:val="16"/>
+              </w:rPr>
+              <w:t xml:space="preserve">EXPLAIN YOUR REASONING</w:t>
+            </w:r>
+          </w:p>
+        </w:tc>
+      </w:tr>
+      <w:tr>
+        <w:trPr>
+          <w:cantSplit/>
+        </w:trPr>
+        <w:tc>
+          <w:tcPr>
+            <w:tcW w:type="dxa" w:w="2800"/>
+            <w:tcMar>
+              <w:top w:type="dxa" w:w="80"/>
+              <w:left w:type="dxa" w:w="100"/>
+              <w:bottom w:type="dxa" w:w="80"/>
+              <w:right w:type="dxa" w:w="100"/>
+            </w:tcMar>
+            <w:vAlign w:val="top"/>
+          </w:tcPr>
+          <w:p>
+            <w:pPr>
+              <w:spacing w:after="60"/>
+            </w:pPr>
+            <w:r>
+              <w:rPr>
+                <w:b/>
+                <w:bCs/>
+                <w:color w:val="12355B"/>
+                <w:sz w:val="21"/>
+                <w:szCs w:val="21"/>
+              </w:rPr>
+              <w:t xml:space="preserve">1.  </w:t>
+            </w:r>
+            <w:r>
+              <w:rPr>
+                <w:b/>
+                <w:bCs/>
+                <w:sz w:val="20"/>
+                <w:szCs w:val="20"/>
+              </w:rPr>
+              <w:t xml:space="preserve">Another correct decomposition of 78.5 is:</w:t>
+            </w:r>
+          </w:p>
+          <w:p>
+            <w:pPr>
+              <w:spacing w:after="30"/>
+              <w:ind w:left="180"/>
+            </w:pPr>
+            <w:r>
+              <w:rPr>
+                <w:sz w:val="19"/>
+                <w:szCs w:val="19"/>
+              </w:rPr>
+              <w:t xml:space="preserve">A)  75 − 3.5</w:t>
+            </w:r>
+          </w:p>
+          <w:p>
+            <w:pPr>
+              <w:spacing w:after="30"/>
+              <w:ind w:left="180"/>
+            </w:pPr>
+            <w:r>
+              <w:rPr>
+                <w:sz w:val="19"/>
+                <w:szCs w:val="19"/>
+              </w:rPr>
+              <w:t xml:space="preserve">B)  80 − 1.5</w:t>
+            </w:r>
+          </w:p>
+          <w:p>
+            <w:pPr>
+              <w:spacing w:after="30"/>
+              <w:ind w:left="180"/>
+            </w:pPr>
+            <w:r>
+              <w:rPr>
+                <w:sz w:val="19"/>
+                <w:szCs w:val="19"/>
+              </w:rPr>
+              <w:t xml:space="preserve">C)  80 − 2.5</w:t>
+            </w:r>
+          </w:p>
+          <w:p>
+            <w:pPr>
+              <w:spacing w:after="30"/>
+              <w:ind w:left="180"/>
+            </w:pPr>
+            <w:r>
+              <w:rPr>
+                <w:sz w:val="19"/>
+                <w:szCs w:val="19"/>
+              </w:rPr>
+              <w:t xml:space="preserve">D)  80 + 1.5</w:t>
+            </w:r>
+          </w:p>
+        </w:tc>
+        <w:tc>
+          <w:tcPr>
+            <w:tcW w:type="dxa" w:w="3560"/>
+            <w:tcMar>
+              <w:top w:type="dxa" w:w="80"/>
+              <w:left w:type="dxa" w:w="100"/>
+              <w:bottom w:type="dxa" w:w="80"/>
+              <w:right w:type="dxa" w:w="100"/>
+            </w:tcMar>
+            <w:vAlign w:val="top"/>
+          </w:tcPr>
+          <w:p>
+            <w:pPr>
+              <w:pBdr>
+                <w:bottom w:val="single" w:color="AFBECC" w:sz="6"/>
+              </w:pBdr>
+              <w:spacing w:after="30" w:before="150"/>
             </w:pPr>
             <w:r>
               <w:t xml:space="preserve"/>
@@ -3376,7 +3748,147 @@
           </w:p>
           <w:p>
             <w:pPr>
-              <w:spacing w:after="0" w:line="320"/>
+              <w:pBdr>
+                <w:bottom w:val="single" w:color="AFBECC" w:sz="6"/>
+              </w:pBdr>
+              <w:spacing w:after="30" w:before="150"/>
+            </w:pPr>
+            <w:r>
+              <w:t xml:space="preserve"/>
+            </w:r>
+          </w:p>
+          <w:p>
+            <w:pPr>
+              <w:pBdr>
+                <w:bottom w:val="single" w:color="AFBECC" w:sz="6"/>
+              </w:pBdr>
+              <w:spacing w:after="30" w:before="150"/>
+            </w:pPr>
+            <w:r>
+              <w:t xml:space="preserve"/>
+            </w:r>
+          </w:p>
+          <w:p>
+            <w:pPr>
+              <w:pBdr>
+                <w:bottom w:val="single" w:color="AFBECC" w:sz="6"/>
+              </w:pBdr>
+              <w:spacing w:after="30" w:before="150"/>
+            </w:pPr>
+            <w:r>
+              <w:t xml:space="preserve"/>
+            </w:r>
+          </w:p>
+        </w:tc>
+        <w:tc>
+          <w:tcPr>
+            <w:tcW w:type="dxa" w:w="3000"/>
+            <w:shd w:fill="FBF3E2" w:color="auto" w:val="clear"/>
+            <w:tcMar>
+              <w:top w:type="dxa" w:w="80"/>
+              <w:left w:type="dxa" w:w="100"/>
+              <w:bottom w:type="dxa" w:w="80"/>
+              <w:right w:type="dxa" w:w="100"/>
+            </w:tcMar>
+            <w:vAlign w:val="top"/>
+          </w:tcPr>
+          <w:p>
+            <w:pPr>
+              <w:spacing w:after="40"/>
+            </w:pPr>
+            <w:r>
+              <w:rPr>
+                <w:b/>
+                <w:bCs/>
+                <w:color w:val="12355B"/>
+                <w:sz w:val="19"/>
+                <w:szCs w:val="19"/>
+              </w:rPr>
+              <w:t xml:space="preserve">Because... </w:t>
+            </w:r>
+            <w:r>
+              <w:rPr>
+                <w:color w:val="AFBECC"/>
+                <w:sz w:val="19"/>
+                <w:szCs w:val="19"/>
+              </w:rPr>
+              <w:t xml:space="preserve">________________</w:t>
+            </w:r>
+          </w:p>
+          <w:p>
+            <w:pPr>
+              <w:pBdr>
+                <w:bottom w:val="single" w:color="AFBECC" w:sz="6"/>
+              </w:pBdr>
+              <w:spacing w:after="30" w:before="150"/>
+            </w:pPr>
+            <w:r>
+              <w:t xml:space="preserve"/>
+            </w:r>
+          </w:p>
+          <w:p>
+            <w:pPr>
+              <w:spacing w:after="40" w:before="80"/>
+            </w:pPr>
+            <w:r>
+              <w:rPr>
+                <w:b/>
+                <w:bCs/>
+                <w:color w:val="6B4FA0"/>
+                <w:sz w:val="19"/>
+                <w:szCs w:val="19"/>
+              </w:rPr>
+              <w:t xml:space="preserve">Although... </w:t>
+            </w:r>
+            <w:r>
+              <w:rPr>
+                <w:color w:val="AFBECC"/>
+                <w:sz w:val="19"/>
+                <w:szCs w:val="19"/>
+              </w:rPr>
+              <w:t xml:space="preserve">_______________</w:t>
+            </w:r>
+          </w:p>
+          <w:p>
+            <w:pPr>
+              <w:pBdr>
+                <w:bottom w:val="single" w:color="AFBECC" w:sz="6"/>
+              </w:pBdr>
+              <w:spacing w:after="30" w:before="150"/>
+            </w:pPr>
+            <w:r>
+              <w:t xml:space="preserve"/>
+            </w:r>
+          </w:p>
+          <w:p>
+            <w:pPr>
+              <w:spacing w:after="40" w:before="80"/>
+            </w:pPr>
+            <w:r>
+              <w:rPr>
+                <w:b/>
+                <w:bCs/>
+                <w:color w:val="1FA6A2"/>
+                <w:sz w:val="19"/>
+                <w:szCs w:val="19"/>
+              </w:rPr>
+              <w:t xml:space="preserve">Therefore... </w:t>
+            </w:r>
+            <w:r>
+              <w:rPr>
+                <w:color w:val="AFBECC"/>
+                <w:sz w:val="19"/>
+                <w:szCs w:val="19"/>
+              </w:rPr>
+              <w:t xml:space="preserve">______________</w:t>
+            </w:r>
+          </w:p>
+          <w:p>
+            <w:pPr>
+              <w:pBdr>
+                <w:bottom w:val="single" w:color="AFBECC" w:sz="6"/>
+              </w:pBdr>
+              <w:spacing w:after="30" w:before="150"/>
             </w:pPr>
             <w:r>
               <w:t xml:space="preserve"/>
@@ -3387,58 +3899,173 @@
     </w:tbl>
     <w:p>
       <w:pPr>
-        <w:keepNext/>
-        <w:spacing w:after="60" w:before="160"/>
-      </w:pPr>
-      <w:r>
-        <w:rPr>
-          <w:b/>
-          <w:bCs/>
-          <w:color w:val="12355B"/>
-          <w:sz w:val="22"/>
-          <w:szCs w:val="22"/>
-        </w:rPr>
-        <w:t xml:space="preserve">2.  </w:t>
-      </w:r>
-      <w:r>
-        <w:rPr>
-          <w:b/>
-          <w:bCs/>
-          <w:sz w:val="21"/>
-          <w:szCs w:val="21"/>
-        </w:rPr>
-        <w:t xml:space="preserve">Name one way you used math outside of school this week.</w:t>
+        <w:spacing w:after="80"/>
+      </w:pPr>
+      <w:r>
+        <w:t xml:space="preserve"/>
       </w:r>
     </w:p>
     <w:tbl>
       <w:tblPr>
-        <w:tblW w:type="pct" w:w="100%"/>
+        <w:tblW w:type="dxa" w:w="9360"/>
         <w:tblBorders>
           <w:top w:val="single" w:color="C7D2DD" w:sz="6"/>
           <w:left w:val="single" w:color="C7D2DD" w:sz="6"/>
           <w:bottom w:val="single" w:color="C7D2DD" w:sz="6"/>
           <w:right w:val="single" w:color="C7D2DD" w:sz="6"/>
-          <w:insideH w:val="single" w:color="auto" w:sz="4"/>
-          <w:insideV w:val="single" w:color="auto" w:sz="4"/>
+          <w:insideH w:val="single" w:color="C7D2DD" w:sz="6"/>
+          <w:insideV w:val="single" w:color="C7D2DD" w:sz="6"/>
         </w:tblBorders>
       </w:tblPr>
       <w:tblGrid>
-        <w:gridCol w:w="100"/>
+        <w:gridCol w:w="2800"/>
+        <w:gridCol w:w="3560"/>
+        <w:gridCol w:w="3000"/>
       </w:tblGrid>
       <w:tr>
-        <w:tc>
-          <w:tcPr>
+        <w:trPr>
+          <w:cantSplit/>
+          <w:tblHeader/>
+        </w:trPr>
+        <w:tc>
+          <w:tcPr>
+            <w:tcW w:type="dxa" w:w="2800"/>
+            <w:shd w:fill="EEF4F8" w:color="auto" w:val="clear"/>
+            <w:tcMar>
+              <w:top w:type="dxa" w:w="60"/>
+              <w:left w:type="dxa" w:w="100"/>
+              <w:bottom w:type="dxa" w:w="60"/>
+              <w:right w:type="dxa" w:w="100"/>
+            </w:tcMar>
+          </w:tcPr>
+          <w:p>
+            <w:pPr>
+              <w:spacing w:after="0"/>
+            </w:pPr>
+            <w:r>
+              <w:rPr>
+                <w:b/>
+                <w:bCs/>
+                <w:color w:val="12355B"/>
+                <w:sz w:val="16"/>
+                <w:szCs w:val="16"/>
+              </w:rPr>
+              <w:t xml:space="preserve">CORE PROBLEM / GIVEN REPRESENTATION</w:t>
+            </w:r>
+          </w:p>
+        </w:tc>
+        <w:tc>
+          <w:tcPr>
+            <w:tcW w:type="dxa" w:w="3560"/>
+            <w:shd w:fill="EEF4F8" w:color="auto" w:val="clear"/>
+            <w:tcMar>
+              <w:top w:type="dxa" w:w="60"/>
+              <w:left w:type="dxa" w:w="100"/>
+              <w:bottom w:type="dxa" w:w="60"/>
+              <w:right w:type="dxa" w:w="100"/>
+            </w:tcMar>
+          </w:tcPr>
+          <w:p>
+            <w:pPr>
+              <w:spacing w:after="0"/>
+            </w:pPr>
+            <w:r>
+              <w:rPr>
+                <w:b/>
+                <w:bCs/>
+                <w:color w:val="12355B"/>
+                <w:sz w:val="16"/>
+                <w:szCs w:val="16"/>
+              </w:rPr>
+              <w:t xml:space="preserve">WORKING SPACE / CALCULATION STEPS</w:t>
+            </w:r>
+          </w:p>
+        </w:tc>
+        <w:tc>
+          <w:tcPr>
+            <w:tcW w:type="dxa" w:w="3000"/>
             <w:shd w:fill="FBF3E2" w:color="auto" w:val="clear"/>
             <w:tcMar>
               <w:top w:type="dxa" w:w="60"/>
-              <w:left w:type="dxa" w:w="120"/>
+              <w:left w:type="dxa" w:w="100"/>
               <w:bottom w:type="dxa" w:w="60"/>
-              <w:right w:type="dxa" w:w="120"/>
-            </w:tcMar>
-          </w:tcPr>
-          <w:p>
-            <w:pPr>
-              <w:spacing w:after="0" w:line="320"/>
+              <w:right w:type="dxa" w:w="100"/>
+            </w:tcMar>
+          </w:tcPr>
+          <w:p>
+            <w:pPr>
+              <w:spacing w:after="0"/>
+            </w:pPr>
+            <w:r>
+              <w:rPr>
+                <w:b/>
+                <w:bCs/>
+                <w:color w:val="B97A12"/>
+                <w:sz w:val="16"/>
+                <w:szCs w:val="16"/>
+              </w:rPr>
+              <w:t xml:space="preserve">EXPLAIN YOUR REASONING</w:t>
+            </w:r>
+          </w:p>
+        </w:tc>
+      </w:tr>
+      <w:tr>
+        <w:trPr>
+          <w:cantSplit/>
+        </w:trPr>
+        <w:tc>
+          <w:tcPr>
+            <w:tcW w:type="dxa" w:w="2800"/>
+            <w:tcMar>
+              <w:top w:type="dxa" w:w="80"/>
+              <w:left w:type="dxa" w:w="100"/>
+              <w:bottom w:type="dxa" w:w="80"/>
+              <w:right w:type="dxa" w:w="100"/>
+            </w:tcMar>
+            <w:vAlign w:val="top"/>
+          </w:tcPr>
+          <w:p>
+            <w:pPr>
+              <w:spacing w:after="60"/>
+            </w:pPr>
+            <w:r>
+              <w:rPr>
+                <w:b/>
+                <w:bCs/>
+                <w:color w:val="12355B"/>
+                <w:sz w:val="21"/>
+                <w:szCs w:val="21"/>
+              </w:rPr>
+              <w:t xml:space="preserve">2.  </w:t>
+            </w:r>
+            <w:r>
+              <w:rPr>
+                <w:b/>
+                <w:bCs/>
+                <w:sz w:val="20"/>
+                <w:szCs w:val="20"/>
+              </w:rPr>
+              <w:t xml:space="preserve">Name one way you used math outside of school this week.</w:t>
+            </w:r>
+          </w:p>
+        </w:tc>
+        <w:tc>
+          <w:tcPr>
+            <w:tcW w:type="dxa" w:w="3560"/>
+            <w:tcMar>
+              <w:top w:type="dxa" w:w="80"/>
+              <w:left w:type="dxa" w:w="100"/>
+              <w:bottom w:type="dxa" w:w="80"/>
+              <w:right w:type="dxa" w:w="100"/>
+            </w:tcMar>
+            <w:vAlign w:val="top"/>
+          </w:tcPr>
+          <w:p>
+            <w:pPr>
+              <w:pBdr>
+                <w:bottom w:val="single" w:color="AFBECC" w:sz="6"/>
+              </w:pBdr>
+              <w:spacing w:after="30" w:before="150"/>
             </w:pPr>
             <w:r>
               <w:t xml:space="preserve"/>
@@ -3446,7 +4073,10 @@
           </w:p>
           <w:p>
             <w:pPr>
-              <w:spacing w:after="0" w:line="320"/>
+              <w:pBdr>
+                <w:bottom w:val="single" w:color="AFBECC" w:sz="6"/>
+              </w:pBdr>
+              <w:spacing w:after="30" w:before="150"/>
             </w:pPr>
             <w:r>
               <w:t xml:space="preserve"/>
@@ -3454,7 +4084,10 @@
           </w:p>
           <w:p>
             <w:pPr>
-              <w:spacing w:after="0" w:line="320"/>
+              <w:pBdr>
+                <w:bottom w:val="single" w:color="AFBECC" w:sz="6"/>
+              </w:pBdr>
+              <w:spacing w:after="30" w:before="150"/>
             </w:pPr>
             <w:r>
               <w:t xml:space="preserve"/>
@@ -3462,7 +4095,125 @@
           </w:p>
           <w:p>
             <w:pPr>
-              <w:spacing w:after="0" w:line="320"/>
+              <w:pBdr>
+                <w:bottom w:val="single" w:color="AFBECC" w:sz="6"/>
+              </w:pBdr>
+              <w:spacing w:after="30" w:before="150"/>
+            </w:pPr>
+            <w:r>
+              <w:t xml:space="preserve"/>
+            </w:r>
+          </w:p>
+        </w:tc>
+        <w:tc>
+          <w:tcPr>
+            <w:tcW w:type="dxa" w:w="3000"/>
+            <w:shd w:fill="FBF3E2" w:color="auto" w:val="clear"/>
+            <w:tcMar>
+              <w:top w:type="dxa" w:w="80"/>
+              <w:left w:type="dxa" w:w="100"/>
+              <w:bottom w:type="dxa" w:w="80"/>
+              <w:right w:type="dxa" w:w="100"/>
+            </w:tcMar>
+            <w:vAlign w:val="top"/>
+          </w:tcPr>
+          <w:p>
+            <w:pPr>
+              <w:spacing w:after="40"/>
+            </w:pPr>
+            <w:r>
+              <w:rPr>
+                <w:b/>
+                <w:bCs/>
+                <w:color w:val="12355B"/>
+                <w:sz w:val="19"/>
+                <w:szCs w:val="19"/>
+              </w:rPr>
+              <w:t xml:space="preserve">Because... </w:t>
+            </w:r>
+            <w:r>
+              <w:rPr>
+                <w:color w:val="AFBECC"/>
+                <w:sz w:val="19"/>
+                <w:szCs w:val="19"/>
+              </w:rPr>
+              <w:t xml:space="preserve">________________</w:t>
+            </w:r>
+          </w:p>
+          <w:p>
+            <w:pPr>
+              <w:pBdr>
+                <w:bottom w:val="single" w:color="AFBECC" w:sz="6"/>
+              </w:pBdr>
+              <w:spacing w:after="30" w:before="150"/>
+            </w:pPr>
+            <w:r>
+              <w:t xml:space="preserve"/>
+            </w:r>
+          </w:p>
+          <w:p>
+            <w:pPr>
+              <w:spacing w:after="40" w:before="80"/>
+            </w:pPr>
+            <w:r>
+              <w:rPr>
+                <w:b/>
+                <w:bCs/>
+                <w:color w:val="6B4FA0"/>
+                <w:sz w:val="19"/>
+                <w:szCs w:val="19"/>
+              </w:rPr>
+              <w:t xml:space="preserve">Although... </w:t>
+            </w:r>
+            <w:r>
+              <w:rPr>
+                <w:color w:val="AFBECC"/>
+                <w:sz w:val="19"/>
+                <w:szCs w:val="19"/>
+              </w:rPr>
+              <w:t xml:space="preserve">_______________</w:t>
+            </w:r>
+          </w:p>
+          <w:p>
+            <w:pPr>
+              <w:pBdr>
+                <w:bottom w:val="single" w:color="AFBECC" w:sz="6"/>
+              </w:pBdr>
+              <w:spacing w:after="30" w:before="150"/>
+            </w:pPr>
+            <w:r>
+              <w:t xml:space="preserve"/>
+            </w:r>
+          </w:p>
+          <w:p>
+            <w:pPr>
+              <w:spacing w:after="40" w:before="80"/>
+            </w:pPr>
+            <w:r>
+              <w:rPr>
+                <w:b/>
+                <w:bCs/>
+                <w:color w:val="1FA6A2"/>
+                <w:sz w:val="19"/>
+                <w:szCs w:val="19"/>
+              </w:rPr>
+              <w:t xml:space="preserve">Therefore... </w:t>
+            </w:r>
+            <w:r>
+              <w:rPr>
+                <w:color w:val="AFBECC"/>
+                <w:sz w:val="19"/>
+                <w:szCs w:val="19"/>
+              </w:rPr>
+              <w:t xml:space="preserve">______________</w:t>
+            </w:r>
+          </w:p>
+          <w:p>
+            <w:pPr>
+              <w:pBdr>
+                <w:bottom w:val="single" w:color="AFBECC" w:sz="6"/>
+              </w:pBdr>
+              <w:spacing w:after="30" w:before="150"/>
             </w:pPr>
             <w:r>
               <w:t xml:space="preserve"/>
@@ -3473,84 +4224,7 @@
     </w:tbl>
     <w:p>
       <w:pPr>
-        <w:keepNext/>
-        <w:spacing w:after="60" w:before="160"/>
-      </w:pPr>
-      <w:r>
-        <w:rPr>
-          <w:b/>
-          <w:bCs/>
-          <w:color w:val="12355B"/>
-          <w:sz w:val="22"/>
-          <w:szCs w:val="22"/>
-        </w:rPr>
-        <w:t xml:space="preserve">3.  </w:t>
-      </w:r>
-      <w:r>
-        <w:rPr>
-          <w:b/>
-          <w:bCs/>
-          <w:sz w:val="21"/>
-          <w:szCs w:val="21"/>
-        </w:rPr>
-        <w:t xml:space="preserve">What does it mean to ESTIMATE how many people are on the Ferris wheel?</w:t>
-      </w:r>
-    </w:p>
-    <w:p>
-      <w:pPr>
-        <w:spacing w:after="40"/>
-        <w:ind w:left="420"/>
-      </w:pPr>
-      <w:r>
-        <w:rPr>
-          <w:sz w:val="20"/>
-          <w:szCs w:val="20"/>
-        </w:rPr>
-        <w:t xml:space="preserve">A)  Count every single person exactly</w:t>
-      </w:r>
-    </w:p>
-    <w:p>
-      <w:pPr>
-        <w:spacing w:after="40"/>
-        <w:ind w:left="420"/>
-      </w:pPr>
-      <w:r>
-        <w:rPr>
-          <w:sz w:val="20"/>
-          <w:szCs w:val="20"/>
-        </w:rPr>
-        <w:t xml:space="preserve">B)  Guess any number at random</w:t>
-      </w:r>
-    </w:p>
-    <w:p>
-      <w:pPr>
-        <w:spacing w:after="40"/>
-        <w:ind w:left="420"/>
-      </w:pPr>
-      <w:r>
-        <w:rPr>
-          <w:sz w:val="20"/>
-          <w:szCs w:val="20"/>
-        </w:rPr>
-        <w:t xml:space="preserve">C)  Give a reasoned answer that is close enough to be useful</w:t>
-      </w:r>
-    </w:p>
-    <w:p>
-      <w:pPr>
-        <w:spacing w:after="40"/>
-        <w:ind w:left="420"/>
-      </w:pPr>
-      <w:r>
-        <w:rPr>
-          <w:sz w:val="20"/>
-          <w:szCs w:val="20"/>
-        </w:rPr>
-        <w:t xml:space="preserve">D)  Refuse to answer without more data</w:t>
-      </w:r>
-    </w:p>
-    <w:p>
-      <w:pPr>
-        <w:spacing w:after="20"/>
+        <w:spacing w:after="80"/>
       </w:pPr>
       <w:r>
         <w:t xml:space="preserve"/>
@@ -3558,33 +4232,217 @@
     </w:p>
     <w:tbl>
       <w:tblPr>
-        <w:tblW w:type="pct" w:w="100%"/>
+        <w:tblW w:type="dxa" w:w="9360"/>
         <w:tblBorders>
           <w:top w:val="single" w:color="C7D2DD" w:sz="6"/>
           <w:left w:val="single" w:color="C7D2DD" w:sz="6"/>
           <w:bottom w:val="single" w:color="C7D2DD" w:sz="6"/>
           <w:right w:val="single" w:color="C7D2DD" w:sz="6"/>
-          <w:insideH w:val="single" w:color="auto" w:sz="4"/>
-          <w:insideV w:val="single" w:color="auto" w:sz="4"/>
+          <w:insideH w:val="single" w:color="C7D2DD" w:sz="6"/>
+          <w:insideV w:val="single" w:color="C7D2DD" w:sz="6"/>
         </w:tblBorders>
       </w:tblPr>
       <w:tblGrid>
-        <w:gridCol w:w="100"/>
+        <w:gridCol w:w="2800"/>
+        <w:gridCol w:w="3560"/>
+        <w:gridCol w:w="3000"/>
       </w:tblGrid>
       <w:tr>
-        <w:tc>
-          <w:tcPr>
+        <w:trPr>
+          <w:cantSplit/>
+          <w:tblHeader/>
+        </w:trPr>
+        <w:tc>
+          <w:tcPr>
+            <w:tcW w:type="dxa" w:w="2800"/>
+            <w:shd w:fill="EEF4F8" w:color="auto" w:val="clear"/>
+            <w:tcMar>
+              <w:top w:type="dxa" w:w="60"/>
+              <w:left w:type="dxa" w:w="100"/>
+              <w:bottom w:type="dxa" w:w="60"/>
+              <w:right w:type="dxa" w:w="100"/>
+            </w:tcMar>
+          </w:tcPr>
+          <w:p>
+            <w:pPr>
+              <w:spacing w:after="0"/>
+            </w:pPr>
+            <w:r>
+              <w:rPr>
+                <w:b/>
+                <w:bCs/>
+                <w:color w:val="12355B"/>
+                <w:sz w:val="16"/>
+                <w:szCs w:val="16"/>
+              </w:rPr>
+              <w:t xml:space="preserve">CORE PROBLEM / GIVEN REPRESENTATION</w:t>
+            </w:r>
+          </w:p>
+        </w:tc>
+        <w:tc>
+          <w:tcPr>
+            <w:tcW w:type="dxa" w:w="3560"/>
+            <w:shd w:fill="EEF4F8" w:color="auto" w:val="clear"/>
+            <w:tcMar>
+              <w:top w:type="dxa" w:w="60"/>
+              <w:left w:type="dxa" w:w="100"/>
+              <w:bottom w:type="dxa" w:w="60"/>
+              <w:right w:type="dxa" w:w="100"/>
+            </w:tcMar>
+          </w:tcPr>
+          <w:p>
+            <w:pPr>
+              <w:spacing w:after="0"/>
+            </w:pPr>
+            <w:r>
+              <w:rPr>
+                <w:b/>
+                <w:bCs/>
+                <w:color w:val="12355B"/>
+                <w:sz w:val="16"/>
+                <w:szCs w:val="16"/>
+              </w:rPr>
+              <w:t xml:space="preserve">WORKING SPACE / CALCULATION STEPS</w:t>
+            </w:r>
+          </w:p>
+        </w:tc>
+        <w:tc>
+          <w:tcPr>
+            <w:tcW w:type="dxa" w:w="3000"/>
             <w:shd w:fill="FBF3E2" w:color="auto" w:val="clear"/>
             <w:tcMar>
               <w:top w:type="dxa" w:w="60"/>
-              <w:left w:type="dxa" w:w="120"/>
+              <w:left w:type="dxa" w:w="100"/>
               <w:bottom w:type="dxa" w:w="60"/>
-              <w:right w:type="dxa" w:w="120"/>
-            </w:tcMar>
-          </w:tcPr>
-          <w:p>
-            <w:pPr>
-              <w:spacing w:after="0" w:line="320"/>
+              <w:right w:type="dxa" w:w="100"/>
+            </w:tcMar>
+          </w:tcPr>
+          <w:p>
+            <w:pPr>
+              <w:spacing w:after="0"/>
+            </w:pPr>
+            <w:r>
+              <w:rPr>
+                <w:b/>
+                <w:bCs/>
+                <w:color w:val="B97A12"/>
+                <w:sz w:val="16"/>
+                <w:szCs w:val="16"/>
+              </w:rPr>
+              <w:t xml:space="preserve">EXPLAIN YOUR REASONING</w:t>
+            </w:r>
+          </w:p>
+        </w:tc>
+      </w:tr>
+      <w:tr>
+        <w:trPr>
+          <w:cantSplit/>
+        </w:trPr>
+        <w:tc>
+          <w:tcPr>
+            <w:tcW w:type="dxa" w:w="2800"/>
+            <w:tcMar>
+              <w:top w:type="dxa" w:w="80"/>
+              <w:left w:type="dxa" w:w="100"/>
+              <w:bottom w:type="dxa" w:w="80"/>
+              <w:right w:type="dxa" w:w="100"/>
+            </w:tcMar>
+            <w:vAlign w:val="top"/>
+          </w:tcPr>
+          <w:p>
+            <w:pPr>
+              <w:spacing w:after="60"/>
+            </w:pPr>
+            <w:r>
+              <w:rPr>
+                <w:b/>
+                <w:bCs/>
+                <w:color w:val="12355B"/>
+                <w:sz w:val="21"/>
+                <w:szCs w:val="21"/>
+              </w:rPr>
+              <w:t xml:space="preserve">3.  </w:t>
+            </w:r>
+            <w:r>
+              <w:rPr>
+                <w:b/>
+                <w:bCs/>
+                <w:sz w:val="20"/>
+                <w:szCs w:val="20"/>
+              </w:rPr>
+              <w:t xml:space="preserve">What does it mean to ESTIMATE how many people are on the Ferris wheel?</w:t>
+            </w:r>
+          </w:p>
+          <w:p>
+            <w:pPr>
+              <w:spacing w:after="30"/>
+              <w:ind w:left="180"/>
+            </w:pPr>
+            <w:r>
+              <w:rPr>
+                <w:sz w:val="19"/>
+                <w:szCs w:val="19"/>
+              </w:rPr>
+              <w:t xml:space="preserve">A)  Count every single person exactly</w:t>
+            </w:r>
+          </w:p>
+          <w:p>
+            <w:pPr>
+              <w:spacing w:after="30"/>
+              <w:ind w:left="180"/>
+            </w:pPr>
+            <w:r>
+              <w:rPr>
+                <w:sz w:val="19"/>
+                <w:szCs w:val="19"/>
+              </w:rPr>
+              <w:t xml:space="preserve">B)  Guess any number at random</w:t>
+            </w:r>
+          </w:p>
+          <w:p>
+            <w:pPr>
+              <w:spacing w:after="30"/>
+              <w:ind w:left="180"/>
+            </w:pPr>
+            <w:r>
+              <w:rPr>
+                <w:sz w:val="19"/>
+                <w:szCs w:val="19"/>
+              </w:rPr>
+              <w:t xml:space="preserve">C)  Give a reasoned answer that is close enough to be useful</w:t>
+            </w:r>
+          </w:p>
+          <w:p>
+            <w:pPr>
+              <w:spacing w:after="30"/>
+              <w:ind w:left="180"/>
+            </w:pPr>
+            <w:r>
+              <w:rPr>
+                <w:sz w:val="19"/>
+                <w:szCs w:val="19"/>
+              </w:rPr>
+              <w:t xml:space="preserve">D)  Refuse to answer without more data</w:t>
+            </w:r>
+          </w:p>
+        </w:tc>
+        <w:tc>
+          <w:tcPr>
+            <w:tcW w:type="dxa" w:w="3560"/>
+            <w:tcMar>
+              <w:top w:type="dxa" w:w="80"/>
+              <w:left w:type="dxa" w:w="100"/>
+              <w:bottom w:type="dxa" w:w="80"/>
+              <w:right w:type="dxa" w:w="100"/>
+            </w:tcMar>
+            <w:vAlign w:val="top"/>
+          </w:tcPr>
+          <w:p>
+            <w:pPr>
+              <w:pBdr>
+                <w:bottom w:val="single" w:color="AFBECC" w:sz="6"/>
+              </w:pBdr>
+              <w:spacing w:after="30" w:before="150"/>
             </w:pPr>
             <w:r>
               <w:t xml:space="preserve"/>
@@ -3592,7 +4450,147 @@
           </w:p>
           <w:p>
             <w:pPr>
-              <w:spacing w:after="0" w:line="320"/>
+              <w:pBdr>
+                <w:bottom w:val="single" w:color="AFBECC" w:sz="6"/>
+              </w:pBdr>
+              <w:spacing w:after="30" w:before="150"/>
+            </w:pPr>
+            <w:r>
+              <w:t xml:space="preserve"/>
+            </w:r>
+          </w:p>
+          <w:p>
+            <w:pPr>
+              <w:pBdr>
+                <w:bottom w:val="single" w:color="AFBECC" w:sz="6"/>
+              </w:pBdr>
+              <w:spacing w:after="30" w:before="150"/>
+            </w:pPr>
+            <w:r>
+              <w:t xml:space="preserve"/>
+            </w:r>
+          </w:p>
+          <w:p>
+            <w:pPr>
+              <w:pBdr>
+                <w:bottom w:val="single" w:color="AFBECC" w:sz="6"/>
+              </w:pBdr>
+              <w:spacing w:after="30" w:before="150"/>
+            </w:pPr>
+            <w:r>
+              <w:t xml:space="preserve"/>
+            </w:r>
+          </w:p>
+        </w:tc>
+        <w:tc>
+          <w:tcPr>
+            <w:tcW w:type="dxa" w:w="3000"/>
+            <w:shd w:fill="FBF3E2" w:color="auto" w:val="clear"/>
+            <w:tcMar>
+              <w:top w:type="dxa" w:w="80"/>
+              <w:left w:type="dxa" w:w="100"/>
+              <w:bottom w:type="dxa" w:w="80"/>
+              <w:right w:type="dxa" w:w="100"/>
+            </w:tcMar>
+            <w:vAlign w:val="top"/>
+          </w:tcPr>
+          <w:p>
+            <w:pPr>
+              <w:spacing w:after="40"/>
+            </w:pPr>
+            <w:r>
+              <w:rPr>
+                <w:b/>
+                <w:bCs/>
+                <w:color w:val="12355B"/>
+                <w:sz w:val="19"/>
+                <w:szCs w:val="19"/>
+              </w:rPr>
+              <w:t xml:space="preserve">Because... </w:t>
+            </w:r>
+            <w:r>
+              <w:rPr>
+                <w:color w:val="AFBECC"/>
+                <w:sz w:val="19"/>
+                <w:szCs w:val="19"/>
+              </w:rPr>
+              <w:t xml:space="preserve">________________</w:t>
+            </w:r>
+          </w:p>
+          <w:p>
+            <w:pPr>
+              <w:pBdr>
+                <w:bottom w:val="single" w:color="AFBECC" w:sz="6"/>
+              </w:pBdr>
+              <w:spacing w:after="30" w:before="150"/>
+            </w:pPr>
+            <w:r>
+              <w:t xml:space="preserve"/>
+            </w:r>
+          </w:p>
+          <w:p>
+            <w:pPr>
+              <w:spacing w:after="40" w:before="80"/>
+            </w:pPr>
+            <w:r>
+              <w:rPr>
+                <w:b/>
+                <w:bCs/>
+                <w:color w:val="6B4FA0"/>
+                <w:sz w:val="19"/>
+                <w:szCs w:val="19"/>
+              </w:rPr>
+              <w:t xml:space="preserve">Although... </w:t>
+            </w:r>
+            <w:r>
+              <w:rPr>
+                <w:color w:val="AFBECC"/>
+                <w:sz w:val="19"/>
+                <w:szCs w:val="19"/>
+              </w:rPr>
+              <w:t xml:space="preserve">_______________</w:t>
+            </w:r>
+          </w:p>
+          <w:p>
+            <w:pPr>
+              <w:pBdr>
+                <w:bottom w:val="single" w:color="AFBECC" w:sz="6"/>
+              </w:pBdr>
+              <w:spacing w:after="30" w:before="150"/>
+            </w:pPr>
+            <w:r>
+              <w:t xml:space="preserve"/>
+            </w:r>
+          </w:p>
+          <w:p>
+            <w:pPr>
+              <w:spacing w:after="40" w:before="80"/>
+            </w:pPr>
+            <w:r>
+              <w:rPr>
+                <w:b/>
+                <w:bCs/>
+                <w:color w:val="1FA6A2"/>
+                <w:sz w:val="19"/>
+                <w:szCs w:val="19"/>
+              </w:rPr>
+              <w:t xml:space="preserve">Therefore... </w:t>
+            </w:r>
+            <w:r>
+              <w:rPr>
+                <w:color w:val="AFBECC"/>
+                <w:sz w:val="19"/>
+                <w:szCs w:val="19"/>
+              </w:rPr>
+              <w:t xml:space="preserve">______________</w:t>
+            </w:r>
+          </w:p>
+          <w:p>
+            <w:pPr>
+              <w:pBdr>
+                <w:bottom w:val="single" w:color="AFBECC" w:sz="6"/>
+              </w:pBdr>
+              <w:spacing w:after="30" w:before="150"/>
             </w:pPr>
             <w:r>
               <w:t xml:space="preserve"/>
@@ -3603,58 +4601,173 @@
     </w:tbl>
     <w:p>
       <w:pPr>
-        <w:keepNext/>
-        <w:spacing w:after="60" w:before="160"/>
-      </w:pPr>
-      <w:r>
-        <w:rPr>
-          <w:b/>
-          <w:bCs/>
-          <w:color w:val="12355B"/>
-          <w:sz w:val="22"/>
-          <w:szCs w:val="22"/>
-        </w:rPr>
-        <w:t xml:space="preserve">4.  </w:t>
-      </w:r>
-      <w:r>
-        <w:rPr>
-          <w:b/>
-          <w:bCs/>
-          <w:sz w:val="21"/>
-          <w:szCs w:val="21"/>
-        </w:rPr>
-        <w:t xml:space="preserve">Tell one thing you already do well in math.</w:t>
+        <w:spacing w:after="80"/>
+      </w:pPr>
+      <w:r>
+        <w:t xml:space="preserve"/>
       </w:r>
     </w:p>
     <w:tbl>
       <w:tblPr>
-        <w:tblW w:type="pct" w:w="100%"/>
+        <w:tblW w:type="dxa" w:w="9360"/>
         <w:tblBorders>
           <w:top w:val="single" w:color="C7D2DD" w:sz="6"/>
           <w:left w:val="single" w:color="C7D2DD" w:sz="6"/>
           <w:bottom w:val="single" w:color="C7D2DD" w:sz="6"/>
           <w:right w:val="single" w:color="C7D2DD" w:sz="6"/>
-          <w:insideH w:val="single" w:color="auto" w:sz="4"/>
-          <w:insideV w:val="single" w:color="auto" w:sz="4"/>
+          <w:insideH w:val="single" w:color="C7D2DD" w:sz="6"/>
+          <w:insideV w:val="single" w:color="C7D2DD" w:sz="6"/>
         </w:tblBorders>
       </w:tblPr>
       <w:tblGrid>
-        <w:gridCol w:w="100"/>
+        <w:gridCol w:w="2800"/>
+        <w:gridCol w:w="3560"/>
+        <w:gridCol w:w="3000"/>
       </w:tblGrid>
       <w:tr>
-        <w:tc>
-          <w:tcPr>
+        <w:trPr>
+          <w:cantSplit/>
+          <w:tblHeader/>
+        </w:trPr>
+        <w:tc>
+          <w:tcPr>
+            <w:tcW w:type="dxa" w:w="2800"/>
+            <w:shd w:fill="EEF4F8" w:color="auto" w:val="clear"/>
+            <w:tcMar>
+              <w:top w:type="dxa" w:w="60"/>
+              <w:left w:type="dxa" w:w="100"/>
+              <w:bottom w:type="dxa" w:w="60"/>
+              <w:right w:type="dxa" w:w="100"/>
+            </w:tcMar>
+          </w:tcPr>
+          <w:p>
+            <w:pPr>
+              <w:spacing w:after="0"/>
+            </w:pPr>
+            <w:r>
+              <w:rPr>
+                <w:b/>
+                <w:bCs/>
+                <w:color w:val="12355B"/>
+                <w:sz w:val="16"/>
+                <w:szCs w:val="16"/>
+              </w:rPr>
+              <w:t xml:space="preserve">CORE PROBLEM / GIVEN REPRESENTATION</w:t>
+            </w:r>
+          </w:p>
+        </w:tc>
+        <w:tc>
+          <w:tcPr>
+            <w:tcW w:type="dxa" w:w="3560"/>
+            <w:shd w:fill="EEF4F8" w:color="auto" w:val="clear"/>
+            <w:tcMar>
+              <w:top w:type="dxa" w:w="60"/>
+              <w:left w:type="dxa" w:w="100"/>
+              <w:bottom w:type="dxa" w:w="60"/>
+              <w:right w:type="dxa" w:w="100"/>
+            </w:tcMar>
+          </w:tcPr>
+          <w:p>
+            <w:pPr>
+              <w:spacing w:after="0"/>
+            </w:pPr>
+            <w:r>
+              <w:rPr>
+                <w:b/>
+                <w:bCs/>
+                <w:color w:val="12355B"/>
+                <w:sz w:val="16"/>
+                <w:szCs w:val="16"/>
+              </w:rPr>
+              <w:t xml:space="preserve">WORKING SPACE / CALCULATION STEPS</w:t>
+            </w:r>
+          </w:p>
+        </w:tc>
+        <w:tc>
+          <w:tcPr>
+            <w:tcW w:type="dxa" w:w="3000"/>
             <w:shd w:fill="FBF3E2" w:color="auto" w:val="clear"/>
             <w:tcMar>
               <w:top w:type="dxa" w:w="60"/>
-              <w:left w:type="dxa" w:w="120"/>
+              <w:left w:type="dxa" w:w="100"/>
               <w:bottom w:type="dxa" w:w="60"/>
-              <w:right w:type="dxa" w:w="120"/>
-            </w:tcMar>
-          </w:tcPr>
-          <w:p>
-            <w:pPr>
-              <w:spacing w:after="0" w:line="320"/>
+              <w:right w:type="dxa" w:w="100"/>
+            </w:tcMar>
+          </w:tcPr>
+          <w:p>
+            <w:pPr>
+              <w:spacing w:after="0"/>
+            </w:pPr>
+            <w:r>
+              <w:rPr>
+                <w:b/>
+                <w:bCs/>
+                <w:color w:val="B97A12"/>
+                <w:sz w:val="16"/>
+                <w:szCs w:val="16"/>
+              </w:rPr>
+              <w:t xml:space="preserve">EXPLAIN YOUR REASONING</w:t>
+            </w:r>
+          </w:p>
+        </w:tc>
+      </w:tr>
+      <w:tr>
+        <w:trPr>
+          <w:cantSplit/>
+        </w:trPr>
+        <w:tc>
+          <w:tcPr>
+            <w:tcW w:type="dxa" w:w="2800"/>
+            <w:tcMar>
+              <w:top w:type="dxa" w:w="80"/>
+              <w:left w:type="dxa" w:w="100"/>
+              <w:bottom w:type="dxa" w:w="80"/>
+              <w:right w:type="dxa" w:w="100"/>
+            </w:tcMar>
+            <w:vAlign w:val="top"/>
+          </w:tcPr>
+          <w:p>
+            <w:pPr>
+              <w:spacing w:after="60"/>
+            </w:pPr>
+            <w:r>
+              <w:rPr>
+                <w:b/>
+                <w:bCs/>
+                <w:color w:val="12355B"/>
+                <w:sz w:val="21"/>
+                <w:szCs w:val="21"/>
+              </w:rPr>
+              <w:t xml:space="preserve">4.  </w:t>
+            </w:r>
+            <w:r>
+              <w:rPr>
+                <w:b/>
+                <w:bCs/>
+                <w:sz w:val="20"/>
+                <w:szCs w:val="20"/>
+              </w:rPr>
+              <w:t xml:space="preserve">Tell one thing you already do well in math.</w:t>
+            </w:r>
+          </w:p>
+        </w:tc>
+        <w:tc>
+          <w:tcPr>
+            <w:tcW w:type="dxa" w:w="3560"/>
+            <w:tcMar>
+              <w:top w:type="dxa" w:w="80"/>
+              <w:left w:type="dxa" w:w="100"/>
+              <w:bottom w:type="dxa" w:w="80"/>
+              <w:right w:type="dxa" w:w="100"/>
+            </w:tcMar>
+            <w:vAlign w:val="top"/>
+          </w:tcPr>
+          <w:p>
+            <w:pPr>
+              <w:pBdr>
+                <w:bottom w:val="single" w:color="AFBECC" w:sz="6"/>
+              </w:pBdr>
+              <w:spacing w:after="30" w:before="150"/>
             </w:pPr>
             <w:r>
               <w:t xml:space="preserve"/>
@@ -3662,7 +4775,10 @@
           </w:p>
           <w:p>
             <w:pPr>
-              <w:spacing w:after="0" w:line="320"/>
+              <w:pBdr>
+                <w:bottom w:val="single" w:color="AFBECC" w:sz="6"/>
+              </w:pBdr>
+              <w:spacing w:after="30" w:before="150"/>
             </w:pPr>
             <w:r>
               <w:t xml:space="preserve"/>
@@ -3670,7 +4786,10 @@
           </w:p>
           <w:p>
             <w:pPr>
-              <w:spacing w:after="0" w:line="320"/>
+              <w:pBdr>
+                <w:bottom w:val="single" w:color="AFBECC" w:sz="6"/>
+              </w:pBdr>
+              <w:spacing w:after="30" w:before="150"/>
             </w:pPr>
             <w:r>
               <w:t xml:space="preserve"/>
@@ -3678,7 +4797,125 @@
           </w:p>
           <w:p>
             <w:pPr>
-              <w:spacing w:after="0" w:line="320"/>
+              <w:pBdr>
+                <w:bottom w:val="single" w:color="AFBECC" w:sz="6"/>
+              </w:pBdr>
+              <w:spacing w:after="30" w:before="150"/>
+            </w:pPr>
+            <w:r>
+              <w:t xml:space="preserve"/>
+            </w:r>
+          </w:p>
+        </w:tc>
+        <w:tc>
+          <w:tcPr>
+            <w:tcW w:type="dxa" w:w="3000"/>
+            <w:shd w:fill="FBF3E2" w:color="auto" w:val="clear"/>
+            <w:tcMar>
+              <w:top w:type="dxa" w:w="80"/>
+              <w:left w:type="dxa" w:w="100"/>
+              <w:bottom w:type="dxa" w:w="80"/>
+              <w:right w:type="dxa" w:w="100"/>
+            </w:tcMar>
+            <w:vAlign w:val="top"/>
+          </w:tcPr>
+          <w:p>
+            <w:pPr>
+              <w:spacing w:after="40"/>
+            </w:pPr>
+            <w:r>
+              <w:rPr>
+                <w:b/>
+                <w:bCs/>
+                <w:color w:val="12355B"/>
+                <w:sz w:val="19"/>
+                <w:szCs w:val="19"/>
+              </w:rPr>
+              <w:t xml:space="preserve">Because... </w:t>
+            </w:r>
+            <w:r>
+              <w:rPr>
+                <w:color w:val="AFBECC"/>
+                <w:sz w:val="19"/>
+                <w:szCs w:val="19"/>
+              </w:rPr>
+              <w:t xml:space="preserve">________________</w:t>
+            </w:r>
+          </w:p>
+          <w:p>
+            <w:pPr>
+              <w:pBdr>
+                <w:bottom w:val="single" w:color="AFBECC" w:sz="6"/>
+              </w:pBdr>
+              <w:spacing w:after="30" w:before="150"/>
+            </w:pPr>
+            <w:r>
+              <w:t xml:space="preserve"/>
+            </w:r>
+          </w:p>
+          <w:p>
+            <w:pPr>
+              <w:spacing w:after="40" w:before="80"/>
+            </w:pPr>
+            <w:r>
+              <w:rPr>
+                <w:b/>
+                <w:bCs/>
+                <w:color w:val="6B4FA0"/>
+                <w:sz w:val="19"/>
+                <w:szCs w:val="19"/>
+              </w:rPr>
+              <w:t xml:space="preserve">Although... </w:t>
+            </w:r>
+            <w:r>
+              <w:rPr>
+                <w:color w:val="AFBECC"/>
+                <w:sz w:val="19"/>
+                <w:szCs w:val="19"/>
+              </w:rPr>
+              <w:t xml:space="preserve">_______________</w:t>
+            </w:r>
+          </w:p>
+          <w:p>
+            <w:pPr>
+              <w:pBdr>
+                <w:bottom w:val="single" w:color="AFBECC" w:sz="6"/>
+              </w:pBdr>
+              <w:spacing w:after="30" w:before="150"/>
+            </w:pPr>
+            <w:r>
+              <w:t xml:space="preserve"/>
+            </w:r>
+          </w:p>
+          <w:p>
+            <w:pPr>
+              <w:spacing w:after="40" w:before="80"/>
+            </w:pPr>
+            <w:r>
+              <w:rPr>
+                <w:b/>
+                <w:bCs/>
+                <w:color w:val="1FA6A2"/>
+                <w:sz w:val="19"/>
+                <w:szCs w:val="19"/>
+              </w:rPr>
+              <w:t xml:space="preserve">Therefore... </w:t>
+            </w:r>
+            <w:r>
+              <w:rPr>
+                <w:color w:val="AFBECC"/>
+                <w:sz w:val="19"/>
+                <w:szCs w:val="19"/>
+              </w:rPr>
+              <w:t xml:space="preserve">______________</w:t>
+            </w:r>
+          </w:p>
+          <w:p>
+            <w:pPr>
+              <w:pBdr>
+                <w:bottom w:val="single" w:color="AFBECC" w:sz="6"/>
+              </w:pBdr>
+              <w:spacing w:after="30" w:before="150"/>
             </w:pPr>
             <w:r>
               <w:t xml:space="preserve"/>
@@ -3687,6 +4924,14 @@
         </w:tc>
       </w:tr>
     </w:tbl>
+    <w:p>
+      <w:pPr>
+        <w:spacing w:after="80"/>
+      </w:pPr>
+      <w:r>
+        <w:t xml:space="preserve"/>
+      </w:r>
+    </w:p>
     <w:p>
       <w:pPr>
         <w:pStyle w:val="Heading1"/>
@@ -3805,6 +5050,149 @@
         <w:t xml:space="preserve"/>
       </w:r>
     </w:p>
+    <w:p>
+      <w:pPr>
+        <w:spacing w:after="60"/>
+      </w:pPr>
+      <w:r>
+        <w:t xml:space="preserve"/>
+      </w:r>
+    </w:p>
+    <w:tbl>
+      <w:tblPr>
+        <w:tblW w:type="dxa" w:w="9360"/>
+        <w:tblBorders>
+          <w:top w:val="single" w:color="C7D2DD" w:sz="6"/>
+          <w:left w:val="single" w:color="C7D2DD" w:sz="6"/>
+          <w:bottom w:val="single" w:color="C7D2DD" w:sz="6"/>
+          <w:right w:val="single" w:color="C7D2DD" w:sz="6"/>
+          <w:insideH w:val="single" w:color="C7D2DD" w:sz="6"/>
+          <w:insideV w:val="single" w:color="C7D2DD" w:sz="6"/>
+        </w:tblBorders>
+      </w:tblPr>
+      <w:tblGrid>
+        <w:gridCol w:w="3120"/>
+        <w:gridCol w:w="3120"/>
+        <w:gridCol w:w="3120"/>
+      </w:tblGrid>
+      <w:tr>
+        <w:trPr>
+          <w:cantSplit/>
+          <w:tblHeader/>
+        </w:trPr>
+        <w:tc>
+          <w:tcPr>
+            <w:tcW w:type="dxa" w:w="9360"/>
+            <w:gridSpan w:val="3"/>
+            <w:shd w:fill="EEF4F8" w:color="auto" w:val="clear"/>
+            <w:tcMar>
+              <w:top w:type="dxa" w:w="60"/>
+              <w:left w:type="dxa" w:w="100"/>
+              <w:bottom w:type="dxa" w:w="60"/>
+              <w:right w:type="dxa" w:w="100"/>
+            </w:tcMar>
+          </w:tcPr>
+          <w:p>
+            <w:pPr>
+              <w:spacing w:after="0"/>
+            </w:pPr>
+            <w:r>
+              <w:rPr>
+                <w:b/>
+                <w:bCs/>
+                <w:color w:val="12355B"/>
+                <w:sz w:val="18"/>
+                <w:szCs w:val="18"/>
+              </w:rPr>
+              <w:t xml:space="preserve">EXIT CHECK · 3-POINT SELF-ASSESSMENT CHECKLIST</w:t>
+            </w:r>
+          </w:p>
+        </w:tc>
+      </w:tr>
+      <w:tr>
+        <w:trPr>
+          <w:cantSplit/>
+        </w:trPr>
+        <w:tc>
+          <w:tcPr>
+            <w:tcW w:type="dxa" w:w="3120"/>
+            <w:tcMar>
+              <w:top w:type="dxa" w:w="80"/>
+              <w:left w:type="dxa" w:w="100"/>
+              <w:bottom w:type="dxa" w:w="80"/>
+              <w:right w:type="dxa" w:w="100"/>
+            </w:tcMar>
+          </w:tcPr>
+          <w:p>
+            <w:pPr>
+              <w:spacing w:after="0"/>
+            </w:pPr>
+            <w:r>
+              <w:rPr>
+                <w:b/>
+                <w:bCs/>
+                <w:color w:val="1A2733"/>
+                <w:sz w:val="18"/>
+                <w:szCs w:val="18"/>
+              </w:rPr>
+              <w:t xml:space="preserve">☐ 1. Units &amp; Labels Verified</w:t>
+            </w:r>
+          </w:p>
+        </w:tc>
+        <w:tc>
+          <w:tcPr>
+            <w:tcW w:type="dxa" w:w="3120"/>
+            <w:tcMar>
+              <w:top w:type="dxa" w:w="80"/>
+              <w:left w:type="dxa" w:w="100"/>
+              <w:bottom w:type="dxa" w:w="80"/>
+              <w:right w:type="dxa" w:w="100"/>
+            </w:tcMar>
+          </w:tcPr>
+          <w:p>
+            <w:pPr>
+              <w:spacing w:after="0"/>
+            </w:pPr>
+            <w:r>
+              <w:rPr>
+                <w:b/>
+                <w:bCs/>
+                <w:color w:val="1A2733"/>
+                <w:sz w:val="18"/>
+                <w:szCs w:val="18"/>
+              </w:rPr>
+              <w:t xml:space="preserve">☐ 2. Reasoning Stated (Because / Although / Therefore)</w:t>
+            </w:r>
+          </w:p>
+        </w:tc>
+        <w:tc>
+          <w:tcPr>
+            <w:tcW w:type="dxa" w:w="3120"/>
+            <w:tcMar>
+              <w:top w:type="dxa" w:w="80"/>
+              <w:left w:type="dxa" w:w="100"/>
+              <w:bottom w:type="dxa" w:w="80"/>
+              <w:right w:type="dxa" w:w="100"/>
+            </w:tcMar>
+          </w:tcPr>
+          <w:p>
+            <w:pPr>
+              <w:spacing w:after="0"/>
+            </w:pPr>
+            <w:r>
+              <w:rPr>
+                <w:b/>
+                <w:bCs/>
+                <w:color w:val="1A2733"/>
+                <w:sz w:val="18"/>
+                <w:szCs w:val="18"/>
+              </w:rPr>
+              <w:t xml:space="preserve">☐ 3. Calculations Double-Checked</w:t>
+            </w:r>
+          </w:p>
+        </w:tc>
+      </w:tr>
+    </w:tbl>
     <w:sectPr>
       <w:headerReference w:type="default" r:id="rId7"/>
       <w:footerReference w:type="default" r:id="rId8"/>

</xml_diff>